<commit_message>
docs: replace soft copyright documents with actual WaterExpert V1.0 content
- Update spec doc: all 20 tables rewritten to match actual implementation
  - FastAPI + frontend JS architecture, MSCIM/CMFBE models, real UI pages
  - Wusongkou 2586 station, 891-day dataset, scenario triage, Sobol analysis
- Replace code doc: MATLAB prototype -> 25 actual Python source files
  - Backend: FastAPI services (auth, data, jobs, reports, state)
  - Algorithm: MSCIM, CMFBE-ST-GCN, multimodal builder, diagnosis, physics
  - Pipeline: full training pipeline, threshold analysis, agent exports

Co-Authored-By: Claude <noreply@anthropic.com>
</commit_message>
<xml_diff>
--- a/docs/design/软著说明书.docx
+++ b/docs/design/软著说明书.docx
@@ -129,12 +129,7 @@
               <w:jc w:val="left"/>
             </w:pPr>
             <w:r>
-              <w:rPr>
-                <w:rFonts w:ascii="Times New Roman" w:hAnsi="Times New Roman" w:eastAsia="宋体"/>
-                <w:b w:val="0"/>
-                <w:sz w:val="20"/>
-              </w:rPr>
-              <w:t>基于多模态数据融合的水体浊度预测系统</w:t>
+              <w:t>基于多源水质数据融合的水体透明度预测系统</w:t>
             </w:r>
           </w:p>
         </w:tc>
@@ -315,12 +310,7 @@
               <w:jc w:val="left"/>
             </w:pPr>
             <w:r>
-              <w:rPr>
-                <w:rFonts w:ascii="Times New Roman" w:hAnsi="Times New Roman" w:eastAsia="宋体"/>
-                <w:b w:val="0"/>
-                <w:sz w:val="20"/>
-              </w:rPr>
-              <w:t>2026年5月</w:t>
+              <w:t>2026年7月</w:t>
             </w:r>
           </w:p>
         </w:tc>
@@ -883,12 +873,7 @@
               <w:jc w:val="left"/>
             </w:pPr>
             <w:r>
-              <w:rPr>
-                <w:rFonts w:ascii="Times New Roman" w:hAnsi="Times New Roman" w:eastAsia="宋体"/>
-                <w:b w:val="0"/>
-                <w:sz w:val="20"/>
-              </w:rPr>
-              <w:t>基于多模态数据融合的水体浊度预测系统</w:t>
+              <w:t>基于多源水质数据融合的水体透明度预测系统</w:t>
             </w:r>
           </w:p>
         </w:tc>
@@ -945,12 +930,7 @@
               <w:jc w:val="left"/>
             </w:pPr>
             <w:r>
-              <w:rPr>
-                <w:rFonts w:ascii="Times New Roman" w:hAnsi="Times New Roman" w:eastAsia="宋体"/>
-                <w:b w:val="0"/>
-                <w:sz w:val="20"/>
-              </w:rPr>
-              <w:t>水体浊度预测系统</w:t>
+              <w:t>水体透明度预测系统</w:t>
             </w:r>
           </w:p>
         </w:tc>
@@ -1069,11 +1049,6 @@
               <w:jc w:val="left"/>
             </w:pPr>
             <w:r>
-              <w:rPr>
-                <w:rFonts w:ascii="Times New Roman" w:hAnsi="Times New Roman" w:eastAsia="宋体"/>
-                <w:b w:val="0"/>
-                <w:sz w:val="20"/>
-              </w:rPr>
               <w:t>数据处理、智能预测与水环境辅助分析类软件</w:t>
             </w:r>
           </w:p>
@@ -1131,12 +1106,7 @@
               <w:jc w:val="left"/>
             </w:pPr>
             <w:r>
-              <w:rPr>
-                <w:rFonts w:ascii="Times New Roman" w:hAnsi="Times New Roman" w:eastAsia="宋体"/>
-                <w:b w:val="0"/>
-                <w:sz w:val="20"/>
-              </w:rPr>
-              <w:t>B/S架构为主，支持服务端集中部署与浏览器端访问</w:t>
+              <w:t>B/S架构为主，支持服务端集中部署与浏览器端访问；同时提供命令行流水线供批量处理</w:t>
             </w:r>
           </w:p>
         </w:tc>
@@ -1479,32 +1449,24 @@
               <w:jc w:val="left"/>
             </w:pPr>
             <w:r>
-              <w:rPr>
-                <w:rFonts w:ascii="Times New Roman" w:hAnsi="Times New Roman" w:eastAsia="宋体"/>
-                <w:b w:val="0"/>
-                <w:sz w:val="18"/>
-              </w:rPr>
-              <w:t>水质数据、气象数据、水文数据、水利调度数据、站点空间数据；时序库、关系库、图数据库</w:t>
-            </w:r>
-          </w:p>
-        </w:tc>
-        <w:tc>
-          <w:tcPr>
-            <w:tcW w:w="3079" w:type="dxa"/>
-            <w:vAlign w:val="center"/>
-          </w:tcPr>
-          <w:p>
-            <w:pPr>
-              <w:spacing w:after="0" w:line="240" w:lineRule="auto"/>
-              <w:jc w:val="left"/>
-            </w:pPr>
-            <w:r>
-              <w:rPr>
-                <w:rFonts w:ascii="Times New Roman" w:hAnsi="Times New Roman" w:eastAsia="宋体"/>
-                <w:b w:val="0"/>
-                <w:sz w:val="18"/>
-              </w:rPr>
-              <w:t>完成数据接入、清洗、格式统一、缺失值处理、异常值识别、入库存储和历史记录管理</w:t>
+              <w:t>水质数据、气象数据、水文数据、空间站点数据;</w:t>
+              <w:br/>
+              <w:t>SQLite状态存储 + 文件系统产物存储</w:t>
+            </w:r>
+          </w:p>
+        </w:tc>
+        <w:tc>
+          <w:tcPr>
+            <w:tcW w:w="3079" w:type="dxa"/>
+            <w:vAlign w:val="center"/>
+          </w:tcPr>
+          <w:p>
+            <w:pPr>
+              <w:spacing w:after="0" w:line="240" w:lineRule="auto"/>
+              <w:jc w:val="left"/>
+            </w:pPr>
+            <w:r>
+              <w:t>完成多源数据接入、清洗、标准化处理、入库存储和历史记录管理；支持CSV/Excel/JSON文件上传与字段映射</w:t>
             </w:r>
           </w:p>
         </w:tc>
@@ -1560,32 +1522,24 @@
               <w:jc w:val="left"/>
             </w:pPr>
             <w:r>
-              <w:rPr>
-                <w:rFonts w:ascii="Times New Roman" w:hAnsi="Times New Roman" w:eastAsia="宋体"/>
-                <w:b w:val="0"/>
-                <w:sz w:val="18"/>
-              </w:rPr>
-              <w:t>MSCIM浊度预测模型、因果推断模块、知识图谱模块、模型评估模块</w:t>
-            </w:r>
-          </w:p>
-        </w:tc>
-        <w:tc>
-          <w:tcPr>
-            <w:tcW w:w="3079" w:type="dxa"/>
-            <w:vAlign w:val="center"/>
-          </w:tcPr>
-          <w:p>
-            <w:pPr>
-              <w:spacing w:after="0" w:line="240" w:lineRule="auto"/>
-              <w:jc w:val="left"/>
-            </w:pPr>
-            <w:r>
-              <w:rPr>
-                <w:rFonts w:ascii="Times New Roman" w:hAnsi="Times New Roman" w:eastAsia="宋体"/>
-                <w:b w:val="0"/>
-                <w:sz w:val="18"/>
-              </w:rPr>
-              <w:t>完成多模态特征融合、浊度预测、预测误差分析、致浊因子识别和归因解释</w:t>
+              <w:t>MSCIM预测模型、MSCIM-NoKG消融模型、CMFBE-ST-GCN机制模型;</w:t>
+              <w:br/>
+              <w:t>Sobol灵敏度分析、场景分诊、边界检测</w:t>
+            </w:r>
+          </w:p>
+        </w:tc>
+        <w:tc>
+          <w:tcPr>
+            <w:tcW w:w="3079" w:type="dxa"/>
+            <w:vAlign w:val="center"/>
+          </w:tcPr>
+          <w:p>
+            <w:pPr>
+              <w:spacing w:after="0" w:line="240" w:lineRule="auto"/>
+              <w:jc w:val="left"/>
+            </w:pPr>
+            <w:r>
+              <w:t>完成多模态特征融合、浊度与透明度预测、预测误差分析、致浊因子识别、场景分类与归因解释</w:t>
             </w:r>
           </w:p>
         </w:tc>
@@ -1641,32 +1595,24 @@
               <w:jc w:val="left"/>
             </w:pPr>
             <w:r>
-              <w:rPr>
-                <w:rFonts w:ascii="Times New Roman" w:hAnsi="Times New Roman" w:eastAsia="宋体"/>
-                <w:b w:val="0"/>
-                <w:sz w:val="18"/>
-              </w:rPr>
-              <w:t>可视化看板、交互查询、预测对比、诊断报告、用户权限</w:t>
-            </w:r>
-          </w:p>
-        </w:tc>
-        <w:tc>
-          <w:tcPr>
-            <w:tcW w:w="3079" w:type="dxa"/>
-            <w:vAlign w:val="center"/>
-          </w:tcPr>
-          <w:p>
-            <w:pPr>
-              <w:spacing w:after="0" w:line="240" w:lineRule="auto"/>
-              <w:jc w:val="left"/>
-            </w:pPr>
-            <w:r>
-              <w:rPr>
-                <w:rFonts w:ascii="Times New Roman" w:hAnsi="Times New Roman" w:eastAsia="宋体"/>
-                <w:b w:val="0"/>
-                <w:sz w:val="18"/>
-              </w:rPr>
-              <w:t>完成数据查询、趋势展示、地图展示、预测任务配置、报告下载和系统管理</w:t>
+              <w:t>Web前端(HTML/CSS/JS)、FastAPI后端、</w:t>
+              <w:br/>
+              <w:t>报告生成服务、任务调度服务</w:t>
+            </w:r>
+          </w:p>
+        </w:tc>
+        <w:tc>
+          <w:tcPr>
+            <w:tcW w:w="3079" w:type="dxa"/>
+            <w:vAlign w:val="center"/>
+          </w:tcPr>
+          <w:p>
+            <w:pPr>
+              <w:spacing w:after="0" w:line="240" w:lineRule="auto"/>
+              <w:jc w:val="left"/>
+            </w:pPr>
+            <w:r>
+              <w:t>完成用户登录、数据查询、趋势展示、预测任务配置、预测-实测对比、场景分诊展示和报告导出</w:t>
             </w:r>
           </w:p>
         </w:tc>
@@ -1858,11 +1804,6 @@
               <w:jc w:val="left"/>
             </w:pPr>
             <w:r>
-              <w:rPr>
-                <w:rFonts w:ascii="Times New Roman" w:hAnsi="Times New Roman" w:eastAsia="宋体"/>
-                <w:b w:val="0"/>
-                <w:sz w:val="18"/>
-              </w:rPr>
               <w:t>1 数据接入</w:t>
             </w:r>
           </w:p>
@@ -1878,12 +1819,7 @@
               <w:jc w:val="left"/>
             </w:pPr>
             <w:r>
-              <w:rPr>
-                <w:rFonts w:ascii="Times New Roman" w:hAnsi="Times New Roman" w:eastAsia="宋体"/>
-                <w:b w:val="0"/>
-                <w:sz w:val="18"/>
-              </w:rPr>
-              <w:t>监测站点数据、气象数据、水文数据、水利数据</w:t>
+              <w:t>监测站点数据(吴淞口2586等)、气象数据(宝山站)、水文数据(松浦大桥、黄渡)</w:t>
             </w:r>
           </w:p>
         </w:tc>
@@ -1898,12 +1834,7 @@
               <w:jc w:val="left"/>
             </w:pPr>
             <w:r>
-              <w:rPr>
-                <w:rFonts w:ascii="Times New Roman" w:hAnsi="Times New Roman" w:eastAsia="宋体"/>
-                <w:b w:val="0"/>
-                <w:sz w:val="18"/>
-              </w:rPr>
-              <w:t>接口采集、文件导入、字段映射</w:t>
+              <w:t>文件导入(CSV/Excel/JSON)、字段映射、格式校验</w:t>
             </w:r>
           </w:p>
         </w:tc>
@@ -1918,12 +1849,7 @@
               <w:jc w:val="left"/>
             </w:pPr>
             <w:r>
-              <w:rPr>
-                <w:rFonts w:ascii="Times New Roman" w:hAnsi="Times New Roman" w:eastAsia="宋体"/>
-                <w:b w:val="0"/>
-                <w:sz w:val="18"/>
-              </w:rPr>
-              <w:t>原始数据记录</w:t>
+              <w:t>原始数据记录表</w:t>
             </w:r>
           </w:p>
         </w:tc>
@@ -1959,11 +1885,6 @@
               <w:jc w:val="left"/>
             </w:pPr>
             <w:r>
-              <w:rPr>
-                <w:rFonts w:ascii="Times New Roman" w:hAnsi="Times New Roman" w:eastAsia="宋体"/>
-                <w:b w:val="0"/>
-                <w:sz w:val="18"/>
-              </w:rPr>
               <w:t>2 数据治理</w:t>
             </w:r>
           </w:p>
@@ -1979,11 +1900,6 @@
               <w:jc w:val="left"/>
             </w:pPr>
             <w:r>
-              <w:rPr>
-                <w:rFonts w:ascii="Times New Roman" w:hAnsi="Times New Roman" w:eastAsia="宋体"/>
-                <w:b w:val="0"/>
-                <w:sz w:val="18"/>
-              </w:rPr>
               <w:t>原始数据记录</w:t>
             </w:r>
           </w:p>
@@ -1999,12 +1915,7 @@
               <w:jc w:val="left"/>
             </w:pPr>
             <w:r>
-              <w:rPr>
-                <w:rFonts w:ascii="Times New Roman" w:hAnsi="Times New Roman" w:eastAsia="宋体"/>
-                <w:b w:val="0"/>
-                <w:sz w:val="18"/>
-              </w:rPr>
-              <w:t>去重、补缺、异常值处理、时间空间对齐</w:t>
+              <w:t>去重、缺失值处理(插值/前向填充/删除)、异常值识别、时间空间对齐</w:t>
             </w:r>
           </w:p>
         </w:tc>
@@ -2019,12 +1930,7 @@
               <w:jc w:val="left"/>
             </w:pPr>
             <w:r>
-              <w:rPr>
-                <w:rFonts w:ascii="Times New Roman" w:hAnsi="Times New Roman" w:eastAsia="宋体"/>
-                <w:b w:val="0"/>
-                <w:sz w:val="18"/>
-              </w:rPr>
-              <w:t>标准化数据集</w:t>
+              <w:t>标准化多模态数据集(891天训练ready记录)</w:t>
             </w:r>
           </w:p>
         </w:tc>
@@ -2060,11 +1966,6 @@
               <w:jc w:val="left"/>
             </w:pPr>
             <w:r>
-              <w:rPr>
-                <w:rFonts w:ascii="Times New Roman" w:hAnsi="Times New Roman" w:eastAsia="宋体"/>
-                <w:b w:val="0"/>
-                <w:sz w:val="18"/>
-              </w:rPr>
               <w:t>3 特征融合</w:t>
             </w:r>
           </w:p>
@@ -2080,12 +1981,7 @@
               <w:jc w:val="left"/>
             </w:pPr>
             <w:r>
-              <w:rPr>
-                <w:rFonts w:ascii="Times New Roman" w:hAnsi="Times New Roman" w:eastAsia="宋体"/>
-                <w:b w:val="0"/>
-                <w:sz w:val="18"/>
-              </w:rPr>
-              <w:t>标准化水质、水文、气象、水利数据</w:t>
+              <w:t>标准化水质、水文、气象数据</w:t>
             </w:r>
           </w:p>
         </w:tc>
@@ -2100,12 +1996,7 @@
               <w:jc w:val="left"/>
             </w:pPr>
             <w:r>
-              <w:rPr>
-                <w:rFonts w:ascii="Times New Roman" w:hAnsi="Times New Roman" w:eastAsia="宋体"/>
-                <w:b w:val="0"/>
-                <w:sz w:val="18"/>
-              </w:rPr>
-              <w:t>构造时序特征、滞后特征、空间关联特征</w:t>
+              <w:t>构造时序特征、滞后特征、滑动窗口统计量；融入知识图谱先验</w:t>
             </w:r>
           </w:p>
         </w:tc>
@@ -2120,11 +2011,6 @@
               <w:jc w:val="left"/>
             </w:pPr>
             <w:r>
-              <w:rPr>
-                <w:rFonts w:ascii="Times New Roman" w:hAnsi="Times New Roman" w:eastAsia="宋体"/>
-                <w:b w:val="0"/>
-                <w:sz w:val="18"/>
-              </w:rPr>
               <w:t>多模态特征矩阵</w:t>
             </w:r>
           </w:p>
@@ -2161,11 +2047,6 @@
               <w:jc w:val="left"/>
             </w:pPr>
             <w:r>
-              <w:rPr>
-                <w:rFonts w:ascii="Times New Roman" w:hAnsi="Times New Roman" w:eastAsia="宋体"/>
-                <w:b w:val="0"/>
-                <w:sz w:val="18"/>
-              </w:rPr>
               <w:t>4 模型预测</w:t>
             </w:r>
           </w:p>
@@ -2181,11 +2062,6 @@
               <w:jc w:val="left"/>
             </w:pPr>
             <w:r>
-              <w:rPr>
-                <w:rFonts w:ascii="Times New Roman" w:hAnsi="Times New Roman" w:eastAsia="宋体"/>
-                <w:b w:val="0"/>
-                <w:sz w:val="18"/>
-              </w:rPr>
               <w:t>多模态特征矩阵</w:t>
             </w:r>
           </w:p>
@@ -2201,12 +2077,7 @@
               <w:jc w:val="left"/>
             </w:pPr>
             <w:r>
-              <w:rPr>
-                <w:rFonts w:ascii="Times New Roman" w:hAnsi="Times New Roman" w:eastAsia="宋体"/>
-                <w:b w:val="0"/>
-                <w:sz w:val="18"/>
-              </w:rPr>
-              <w:t>MSCIM模型推理与预测模拟</w:t>
+              <w:t>MSCIM / CMFBE-ST-GCN模型推理与预测</w:t>
             </w:r>
           </w:p>
         </w:tc>
@@ -2221,12 +2092,7 @@
               <w:jc w:val="left"/>
             </w:pPr>
             <w:r>
-              <w:rPr>
-                <w:rFonts w:ascii="Times New Roman" w:hAnsi="Times New Roman" w:eastAsia="宋体"/>
-                <w:b w:val="0"/>
-                <w:sz w:val="18"/>
-              </w:rPr>
-              <w:t>浊度预测序列</w:t>
+              <w:t>浊度预测序列、透明度预测序列</w:t>
             </w:r>
           </w:p>
         </w:tc>
@@ -2262,11 +2128,6 @@
               <w:jc w:val="left"/>
             </w:pPr>
             <w:r>
-              <w:rPr>
-                <w:rFonts w:ascii="Times New Roman" w:hAnsi="Times New Roman" w:eastAsia="宋体"/>
-                <w:b w:val="0"/>
-                <w:sz w:val="18"/>
-              </w:rPr>
               <w:t>5 归因诊断</w:t>
             </w:r>
           </w:p>
@@ -2282,11 +2143,6 @@
               <w:jc w:val="left"/>
             </w:pPr>
             <w:r>
-              <w:rPr>
-                <w:rFonts w:ascii="Times New Roman" w:hAnsi="Times New Roman" w:eastAsia="宋体"/>
-                <w:b w:val="0"/>
-                <w:sz w:val="18"/>
-              </w:rPr>
               <w:t>预测结果、实测数据、知识图谱关系</w:t>
             </w:r>
           </w:p>
@@ -2302,12 +2158,7 @@
               <w:jc w:val="left"/>
             </w:pPr>
             <w:r>
-              <w:rPr>
-                <w:rFonts w:ascii="Times New Roman" w:hAnsi="Times New Roman" w:eastAsia="宋体"/>
-                <w:b w:val="0"/>
-                <w:sz w:val="18"/>
-              </w:rPr>
-              <w:t>因果强度计算、主导因子排序、机制解释</w:t>
+              <w:t>因果强度计算、主导因子排序、场景分诊、机制解释</w:t>
             </w:r>
           </w:p>
         </w:tc>
@@ -2322,12 +2173,7 @@
               <w:jc w:val="left"/>
             </w:pPr>
             <w:r>
-              <w:rPr>
-                <w:rFonts w:ascii="Times New Roman" w:hAnsi="Times New Roman" w:eastAsia="宋体"/>
-                <w:b w:val="0"/>
-                <w:sz w:val="18"/>
-              </w:rPr>
-              <w:t>诊断报告</w:t>
+              <w:t>诊断报告、场景分诊表、响应建议</w:t>
             </w:r>
           </w:p>
         </w:tc>
@@ -2517,11 +2363,6 @@
               <w:jc w:val="left"/>
             </w:pPr>
             <w:r>
-              <w:rPr>
-                <w:rFonts w:ascii="Times New Roman" w:hAnsi="Times New Roman" w:eastAsia="宋体"/>
-                <w:b w:val="0"/>
-                <w:sz w:val="18"/>
-              </w:rPr>
               <w:t>Chrome、Edge等现代浏览器</w:t>
             </w:r>
           </w:p>
@@ -2537,12 +2378,7 @@
               <w:jc w:val="left"/>
             </w:pPr>
             <w:r>
-              <w:rPr>
-                <w:rFonts w:ascii="Times New Roman" w:hAnsi="Times New Roman" w:eastAsia="宋体"/>
-                <w:b w:val="0"/>
-                <w:sz w:val="18"/>
-              </w:rPr>
-              <w:t>用于登录系统、查看数据看板、配置预测任务和下载报告</w:t>
+              <w:t>用于登录系统、查看数据看板、上传数据、配置预测任务和下载报告</w:t>
             </w:r>
           </w:p>
         </w:tc>
@@ -2598,32 +2434,22 @@
               <w:jc w:val="left"/>
             </w:pPr>
             <w:r>
-              <w:rPr>
-                <w:rFonts w:ascii="Times New Roman" w:hAnsi="Times New Roman" w:eastAsia="宋体"/>
-                <w:b w:val="0"/>
-                <w:sz w:val="18"/>
-              </w:rPr>
-              <w:t>Web前端框架</w:t>
-            </w:r>
-          </w:p>
-        </w:tc>
-        <w:tc>
-          <w:tcPr>
-            <w:tcW w:w="3079" w:type="dxa"/>
-            <w:vAlign w:val="center"/>
-          </w:tcPr>
-          <w:p>
-            <w:pPr>
-              <w:spacing w:after="0" w:line="240" w:lineRule="auto"/>
-              <w:jc w:val="left"/>
-            </w:pPr>
-            <w:r>
-              <w:rPr>
-                <w:rFonts w:ascii="Times New Roman" w:hAnsi="Times New Roman" w:eastAsia="宋体"/>
-                <w:b w:val="0"/>
-                <w:sz w:val="18"/>
-              </w:rPr>
-              <w:t>实现菜单导航、图表渲染、地图展示和交互查询</w:t>
+              <w:t>HTML5 / CSS3 / ES Module JavaScript</w:t>
+            </w:r>
+          </w:p>
+        </w:tc>
+        <w:tc>
+          <w:tcPr>
+            <w:tcW w:w="3079" w:type="dxa"/>
+            <w:vAlign w:val="center"/>
+          </w:tcPr>
+          <w:p>
+            <w:pPr>
+              <w:spacing w:after="0" w:line="240" w:lineRule="auto"/>
+              <w:jc w:val="left"/>
+            </w:pPr>
+            <w:r>
+              <w:t>实现侧栏导航、图表渲染(SVG)、交互查询和表单提交</w:t>
             </w:r>
           </w:p>
         </w:tc>
@@ -2679,32 +2505,22 @@
               <w:jc w:val="left"/>
             </w:pPr>
             <w:r>
-              <w:rPr>
-                <w:rFonts w:ascii="Times New Roman" w:hAnsi="Times New Roman" w:eastAsia="宋体"/>
-                <w:b w:val="0"/>
-                <w:sz w:val="18"/>
-              </w:rPr>
-              <w:t>Python/Java服务框架</w:t>
-            </w:r>
-          </w:p>
-        </w:tc>
-        <w:tc>
-          <w:tcPr>
-            <w:tcW w:w="3079" w:type="dxa"/>
-            <w:vAlign w:val="center"/>
-          </w:tcPr>
-          <w:p>
-            <w:pPr>
-              <w:spacing w:after="0" w:line="240" w:lineRule="auto"/>
-              <w:jc w:val="left"/>
-            </w:pPr>
-            <w:r>
-              <w:rPr>
-                <w:rFonts w:ascii="Times New Roman" w:hAnsi="Times New Roman" w:eastAsia="宋体"/>
-                <w:b w:val="0"/>
-                <w:sz w:val="18"/>
-              </w:rPr>
-              <w:t>提供数据接口、模型调用、权限管理和任务管理</w:t>
+              <w:t>Python FastAPI + Uvicorn</w:t>
+            </w:r>
+          </w:p>
+        </w:tc>
+        <w:tc>
+          <w:tcPr>
+            <w:tcW w:w="3079" w:type="dxa"/>
+            <w:vAlign w:val="center"/>
+          </w:tcPr>
+          <w:p>
+            <w:pPr>
+              <w:spacing w:after="0" w:line="240" w:lineRule="auto"/>
+              <w:jc w:val="left"/>
+            </w:pPr>
+            <w:r>
+              <w:t>提供REST API、认证服务、任务编排、报告生成和静态文件服务</w:t>
             </w:r>
           </w:p>
         </w:tc>
@@ -2760,32 +2576,22 @@
               <w:jc w:val="left"/>
             </w:pPr>
             <w:r>
-              <w:rPr>
-                <w:rFonts w:ascii="Times New Roman" w:hAnsi="Times New Roman" w:eastAsia="宋体"/>
-                <w:b w:val="0"/>
-                <w:sz w:val="18"/>
-              </w:rPr>
-              <w:t>独立模型推理服务</w:t>
-            </w:r>
-          </w:p>
-        </w:tc>
-        <w:tc>
-          <w:tcPr>
-            <w:tcW w:w="3079" w:type="dxa"/>
-            <w:vAlign w:val="center"/>
-          </w:tcPr>
-          <w:p>
-            <w:pPr>
-              <w:spacing w:after="0" w:line="240" w:lineRule="auto"/>
-              <w:jc w:val="left"/>
-            </w:pPr>
-            <w:r>
-              <w:rPr>
-                <w:rFonts w:ascii="Times New Roman" w:hAnsi="Times New Roman" w:eastAsia="宋体"/>
-                <w:b w:val="0"/>
-                <w:sz w:val="18"/>
-              </w:rPr>
-              <w:t>封装MSCIM模型训练、加载、预测和评估功能</w:t>
+              <w:t>Python PyTorch + 研究脚本</w:t>
+            </w:r>
+          </w:p>
+        </w:tc>
+        <w:tc>
+          <w:tcPr>
+            <w:tcW w:w="3079" w:type="dxa"/>
+            <w:vAlign w:val="center"/>
+          </w:tcPr>
+          <w:p>
+            <w:pPr>
+              <w:spacing w:after="0" w:line="240" w:lineRule="auto"/>
+              <w:jc w:val="left"/>
+            </w:pPr>
+            <w:r>
+              <w:t>封装MSCIM/CMFBE模型训练、加载、预测、评估和分析功能</w:t>
             </w:r>
           </w:p>
         </w:tc>
@@ -2841,32 +2647,22 @@
               <w:jc w:val="left"/>
             </w:pPr>
             <w:r>
-              <w:rPr>
-                <w:rFonts w:ascii="Times New Roman" w:hAnsi="Times New Roman" w:eastAsia="宋体"/>
-                <w:b w:val="0"/>
-                <w:sz w:val="18"/>
-              </w:rPr>
-              <w:t>时序库、关系库、图数据库</w:t>
-            </w:r>
-          </w:p>
-        </w:tc>
-        <w:tc>
-          <w:tcPr>
-            <w:tcW w:w="3079" w:type="dxa"/>
-            <w:vAlign w:val="center"/>
-          </w:tcPr>
-          <w:p>
-            <w:pPr>
-              <w:spacing w:after="0" w:line="240" w:lineRule="auto"/>
-              <w:jc w:val="left"/>
-            </w:pPr>
-            <w:r>
-              <w:rPr>
-                <w:rFonts w:ascii="Times New Roman" w:hAnsi="Times New Roman" w:eastAsia="宋体"/>
-                <w:b w:val="0"/>
-                <w:sz w:val="18"/>
-              </w:rPr>
-              <w:t>分别存储监测序列、业务表和致浊因子关系图谱</w:t>
+              <w:t>SQLite(状态管理) + 文件系统(产物存储)</w:t>
+            </w:r>
+          </w:p>
+        </w:tc>
+        <w:tc>
+          <w:tcPr>
+            <w:tcW w:w="3079" w:type="dxa"/>
+            <w:vAlign w:val="center"/>
+          </w:tcPr>
+          <w:p>
+            <w:pPr>
+              <w:spacing w:after="0" w:line="240" w:lineRule="auto"/>
+              <w:jc w:val="left"/>
+            </w:pPr>
+            <w:r>
+              <w:t>存储用户会话、任务状态、导入记录；管理预测产物、图表、报告和日志</w:t>
             </w:r>
           </w:p>
         </w:tc>
@@ -3065,12 +2861,7 @@
               <w:jc w:val="left"/>
             </w:pPr>
             <w:r>
-              <w:rPr>
-                <w:rFonts w:ascii="Times New Roman" w:hAnsi="Times New Roman" w:eastAsia="宋体"/>
-                <w:b w:val="0"/>
-                <w:sz w:val="18"/>
-              </w:rPr>
-              <w:t>支持接口接入、Excel/CSV文件导入、数据库同步等方式，接收水温、浊度、流速、流量、降雨量、风速、潮位等数据</w:t>
+              <w:t>支持文件上传(CSV/Excel/JSON), 接收水质、气象、水动力等类型数据；支持多文件批量上传</w:t>
             </w:r>
           </w:p>
         </w:tc>
@@ -3146,12 +2937,7 @@
               <w:jc w:val="left"/>
             </w:pPr>
             <w:r>
-              <w:rPr>
-                <w:rFonts w:ascii="Times New Roman" w:hAnsi="Times New Roman" w:eastAsia="宋体"/>
-                <w:b w:val="0"/>
-                <w:sz w:val="18"/>
-              </w:rPr>
-              <w:t>将不同来源的字段名称、单位和数据格式映射到系统标准字段</w:t>
+              <w:t>自动检测数据类型并匹配标准字段；将不同来源的字段名称、单位和格式统一</w:t>
             </w:r>
           </w:p>
         </w:tc>
@@ -3227,12 +3013,7 @@
               <w:jc w:val="left"/>
             </w:pPr>
             <w:r>
-              <w:rPr>
-                <w:rFonts w:ascii="Times New Roman" w:hAnsi="Times New Roman" w:eastAsia="宋体"/>
-                <w:b w:val="0"/>
-                <w:sz w:val="18"/>
-              </w:rPr>
-              <w:t>对重复记录、缺失记录、异常波动和越界值进行识别与处理</w:t>
+              <w:t>对重复记录去重、缺失值处理(插值/前向填充)、异常波动值识别与标记</w:t>
             </w:r>
           </w:p>
         </w:tc>
@@ -3308,12 +3089,7 @@
               <w:jc w:val="left"/>
             </w:pPr>
             <w:r>
-              <w:rPr>
-                <w:rFonts w:ascii="Times New Roman" w:hAnsi="Times New Roman" w:eastAsia="宋体"/>
-                <w:b w:val="0"/>
-                <w:sz w:val="18"/>
-              </w:rPr>
-              <w:t>将不同采样频率的数据统一到小时、日或自定义时间尺度</w:t>
+              <w:t>将不同采样频率的数据统一到日尺度；缺失日期按规则补齐或标记</w:t>
             </w:r>
           </w:p>
         </w:tc>
@@ -3389,12 +3165,7 @@
               <w:jc w:val="left"/>
             </w:pPr>
             <w:r>
-              <w:rPr>
-                <w:rFonts w:ascii="Times New Roman" w:hAnsi="Times New Roman" w:eastAsia="宋体"/>
-                <w:b w:val="0"/>
-                <w:sz w:val="18"/>
-              </w:rPr>
-              <w:t>根据站点经纬度、行政区域、水域名称和监测断面建立空间关联</w:t>
+              <w:t>根据站点经纬度、所属水域和监测断面建立空间关联索引</w:t>
             </w:r>
           </w:p>
         </w:tc>
@@ -3470,12 +3241,7 @@
               <w:jc w:val="left"/>
             </w:pPr>
             <w:r>
-              <w:rPr>
-                <w:rFonts w:ascii="Times New Roman" w:hAnsi="Times New Roman" w:eastAsia="宋体"/>
-                <w:b w:val="0"/>
-                <w:sz w:val="18"/>
-              </w:rPr>
-              <w:t>按数据类别写入时序库、关系库或图数据库</w:t>
+              <w:t>按数据类别写入文件系统或SQLite状态库；记录导入日志</w:t>
             </w:r>
           </w:p>
         </w:tc>
@@ -3698,32 +3464,22 @@
               <w:jc w:val="left"/>
             </w:pPr>
             <w:r>
-              <w:rPr>
-                <w:rFonts w:ascii="Times New Roman" w:hAnsi="Times New Roman" w:eastAsia="宋体"/>
-                <w:b w:val="0"/>
-                <w:sz w:val="18"/>
-              </w:rPr>
-              <w:t>展示监测站点数量、最新浊度、平均浊度、异常点数量、预测任务数量等指标</w:t>
-            </w:r>
-          </w:p>
-        </w:tc>
-        <w:tc>
-          <w:tcPr>
-            <w:tcW w:w="3079" w:type="dxa"/>
-            <w:vAlign w:val="center"/>
-          </w:tcPr>
-          <w:p>
-            <w:pPr>
-              <w:spacing w:after="0" w:line="240" w:lineRule="auto"/>
-              <w:jc w:val="left"/>
-            </w:pPr>
-            <w:r>
-              <w:rPr>
-                <w:rFonts w:ascii="Times New Roman" w:hAnsi="Times New Roman" w:eastAsia="宋体"/>
-                <w:b w:val="0"/>
-                <w:sz w:val="18"/>
-              </w:rPr>
-              <w:t>管理人员快速掌握当前水质状态</w:t>
+              <w:t>展示站点数量、模型性能指标(R squared)、预测任务状态、数据统计摘要等</w:t>
+            </w:r>
+          </w:p>
+        </w:tc>
+        <w:tc>
+          <w:tcPr>
+            <w:tcW w:w="3079" w:type="dxa"/>
+            <w:vAlign w:val="center"/>
+          </w:tcPr>
+          <w:p>
+            <w:pPr>
+              <w:spacing w:after="0" w:line="240" w:lineRule="auto"/>
+              <w:jc w:val="left"/>
+            </w:pPr>
+            <w:r>
+              <w:t>管理人员快速掌握系统运行状态和水质概况</w:t>
             </w:r>
           </w:p>
         </w:tc>
@@ -3779,32 +3535,22 @@
               <w:jc w:val="left"/>
             </w:pPr>
             <w:r>
-              <w:rPr>
-                <w:rFonts w:ascii="Times New Roman" w:hAnsi="Times New Roman" w:eastAsia="宋体"/>
-                <w:b w:val="0"/>
-                <w:sz w:val="18"/>
-              </w:rPr>
-              <w:t>支持查看水温、浊度、降雨量、潮位等指标随时间变化的曲线</w:t>
-            </w:r>
-          </w:p>
-        </w:tc>
-        <w:tc>
-          <w:tcPr>
-            <w:tcW w:w="3079" w:type="dxa"/>
-            <w:vAlign w:val="center"/>
-          </w:tcPr>
-          <w:p>
-            <w:pPr>
-              <w:spacing w:after="0" w:line="240" w:lineRule="auto"/>
-              <w:jc w:val="left"/>
-            </w:pPr>
-            <w:r>
-              <w:rPr>
-                <w:rFonts w:ascii="Times New Roman" w:hAnsi="Times New Roman" w:eastAsia="宋体"/>
-                <w:b w:val="0"/>
-                <w:sz w:val="18"/>
-              </w:rPr>
-              <w:t>分析水温变化曲线或浊度突增过程</w:t>
+              <w:t>支持查看浊度、透明度等指标随时间变化的SVG曲线图</w:t>
+            </w:r>
+          </w:p>
+        </w:tc>
+        <w:tc>
+          <w:tcPr>
+            <w:tcW w:w="3079" w:type="dxa"/>
+            <w:vAlign w:val="center"/>
+          </w:tcPr>
+          <w:p>
+            <w:pPr>
+              <w:spacing w:after="0" w:line="240" w:lineRule="auto"/>
+              <w:jc w:val="left"/>
+            </w:pPr>
+            <w:r>
+              <w:t>分析浊度变化趋势或突增事件</w:t>
             </w:r>
           </w:p>
         </w:tc>
@@ -3860,32 +3606,22 @@
               <w:jc w:val="left"/>
             </w:pPr>
             <w:r>
-              <w:rPr>
-                <w:rFonts w:ascii="Times New Roman" w:hAnsi="Times New Roman" w:eastAsia="宋体"/>
-                <w:b w:val="0"/>
-                <w:sz w:val="18"/>
-              </w:rPr>
-              <w:t>支持多个监测指标在同一时间轴上对比显示</w:t>
-            </w:r>
-          </w:p>
-        </w:tc>
-        <w:tc>
-          <w:tcPr>
-            <w:tcW w:w="3079" w:type="dxa"/>
-            <w:vAlign w:val="center"/>
-          </w:tcPr>
-          <w:p>
-            <w:pPr>
-              <w:spacing w:after="0" w:line="240" w:lineRule="auto"/>
-              <w:jc w:val="left"/>
-            </w:pPr>
-            <w:r>
-              <w:rPr>
-                <w:rFonts w:ascii="Times New Roman" w:hAnsi="Times New Roman" w:eastAsia="宋体"/>
-                <w:b w:val="0"/>
-                <w:sz w:val="18"/>
-              </w:rPr>
-              <w:t>分析降雨、流速与浊度之间的同步变化</w:t>
+              <w:t>支持浊度/透明度多个模型预测曲线在同一图表中对比</w:t>
+            </w:r>
+          </w:p>
+        </w:tc>
+        <w:tc>
+          <w:tcPr>
+            <w:tcW w:w="3079" w:type="dxa"/>
+            <w:vAlign w:val="center"/>
+          </w:tcPr>
+          <w:p>
+            <w:pPr>
+              <w:spacing w:after="0" w:line="240" w:lineRule="auto"/>
+              <w:jc w:val="left"/>
+            </w:pPr>
+            <w:r>
+              <w:t>对比MSCIM与CMFBE在不同时段的预测能力</w:t>
             </w:r>
           </w:p>
         </w:tc>
@@ -3941,32 +3677,22 @@
               <w:jc w:val="left"/>
             </w:pPr>
             <w:r>
-              <w:rPr>
-                <w:rFonts w:ascii="Times New Roman" w:hAnsi="Times New Roman" w:eastAsia="宋体"/>
-                <w:b w:val="0"/>
-                <w:sz w:val="18"/>
-              </w:rPr>
-              <w:t>根据站点经纬度在地图上显示监测点位、浊度等级和区域差异</w:t>
-            </w:r>
-          </w:p>
-        </w:tc>
-        <w:tc>
-          <w:tcPr>
-            <w:tcW w:w="3079" w:type="dxa"/>
-            <w:vAlign w:val="center"/>
-          </w:tcPr>
-          <w:p>
-            <w:pPr>
-              <w:spacing w:after="0" w:line="240" w:lineRule="auto"/>
-              <w:jc w:val="left"/>
-            </w:pPr>
-            <w:r>
-              <w:rPr>
-                <w:rFonts w:ascii="Times New Roman" w:hAnsi="Times New Roman" w:eastAsia="宋体"/>
-                <w:b w:val="0"/>
-                <w:sz w:val="18"/>
-              </w:rPr>
-              <w:t>查看吴淞口等区域的空间分布特征</w:t>
+              <w:t>支持按数据量限制(30-720天)动态加载不同时间跨度的数据</w:t>
+            </w:r>
+          </w:p>
+        </w:tc>
+        <w:tc>
+          <w:tcPr>
+            <w:tcW w:w="3079" w:type="dxa"/>
+            <w:vAlign w:val="center"/>
+          </w:tcPr>
+          <w:p>
+            <w:pPr>
+              <w:spacing w:after="0" w:line="240" w:lineRule="auto"/>
+              <w:jc w:val="left"/>
+            </w:pPr>
+            <w:r>
+              <w:t>聚焦吴淞口特定时间段的浊度变化</w:t>
             </w:r>
           </w:p>
         </w:tc>
@@ -4022,32 +3748,22 @@
               <w:jc w:val="left"/>
             </w:pPr>
             <w:r>
-              <w:rPr>
-                <w:rFonts w:ascii="Times New Roman" w:hAnsi="Times New Roman" w:eastAsia="宋体"/>
-                <w:b w:val="0"/>
-                <w:sz w:val="18"/>
-              </w:rPr>
-              <w:t>支持按日期、站点、水域、指标类型筛选数据</w:t>
-            </w:r>
-          </w:p>
-        </w:tc>
-        <w:tc>
-          <w:tcPr>
-            <w:tcW w:w="3079" w:type="dxa"/>
-            <w:vAlign w:val="center"/>
-          </w:tcPr>
-          <w:p>
-            <w:pPr>
-              <w:spacing w:after="0" w:line="240" w:lineRule="auto"/>
-              <w:jc w:val="left"/>
-            </w:pPr>
-            <w:r>
-              <w:rPr>
-                <w:rFonts w:ascii="Times New Roman" w:hAnsi="Times New Roman" w:eastAsia="宋体"/>
-                <w:b w:val="0"/>
-                <w:sz w:val="18"/>
-              </w:rPr>
-              <w:t>定位某一时段或某一站点的历史记录</w:t>
+              <w:t>支持按站点、指标类型、时间范围筛选；前端即时渲染</w:t>
+            </w:r>
+          </w:p>
+        </w:tc>
+        <w:tc>
+          <w:tcPr>
+            <w:tcW w:w="3079" w:type="dxa"/>
+            <w:vAlign w:val="center"/>
+          </w:tcPr>
+          <w:p>
+            <w:pPr>
+              <w:spacing w:after="0" w:line="240" w:lineRule="auto"/>
+              <w:jc w:val="left"/>
+            </w:pPr>
+            <w:r>
+              <w:t>定位某一时段或某类指标的详细数据</w:t>
             </w:r>
           </w:p>
         </w:tc>
@@ -4250,31 +3966,21 @@
               <w:jc w:val="left"/>
             </w:pPr>
             <w:r>
-              <w:rPr>
-                <w:rFonts w:ascii="Times New Roman" w:hAnsi="Times New Roman" w:eastAsia="宋体"/>
-                <w:b w:val="0"/>
-                <w:sz w:val="18"/>
-              </w:rPr>
-              <w:t>用户选择区域、站点、起止时间、预测步长和输入因子</w:t>
-            </w:r>
-          </w:p>
-        </w:tc>
-        <w:tc>
-          <w:tcPr>
-            <w:tcW w:w="3079" w:type="dxa"/>
-            <w:vAlign w:val="center"/>
-          </w:tcPr>
-          <w:p>
-            <w:pPr>
-              <w:spacing w:after="0" w:line="240" w:lineRule="auto"/>
-              <w:jc w:val="left"/>
-            </w:pPr>
-            <w:r>
-              <w:rPr>
-                <w:rFonts w:ascii="Times New Roman" w:hAnsi="Times New Roman" w:eastAsia="宋体"/>
-                <w:b w:val="0"/>
-                <w:sz w:val="18"/>
-              </w:rPr>
+              <w:t>用户选择站点、起止日期、模型(MSCIM/CMFBE-ST-GCN)和运行模式(快速推理/完整流水线)</w:t>
+            </w:r>
+          </w:p>
+        </w:tc>
+        <w:tc>
+          <w:tcPr>
+            <w:tcW w:w="3079" w:type="dxa"/>
+            <w:vAlign w:val="center"/>
+          </w:tcPr>
+          <w:p>
+            <w:pPr>
+              <w:spacing w:after="0" w:line="240" w:lineRule="auto"/>
+              <w:jc w:val="left"/>
+            </w:pPr>
+            <w:r>
               <w:t>预测任务参数</w:t>
             </w:r>
           </w:p>
@@ -4331,31 +4037,21 @@
               <w:jc w:val="left"/>
             </w:pPr>
             <w:r>
-              <w:rPr>
-                <w:rFonts w:ascii="Times New Roman" w:hAnsi="Times New Roman" w:eastAsia="宋体"/>
-                <w:b w:val="0"/>
-                <w:sz w:val="18"/>
-              </w:rPr>
-              <w:t>系统读取已训练的MSCIM模型参数和特征配置</w:t>
-            </w:r>
-          </w:p>
-        </w:tc>
-        <w:tc>
-          <w:tcPr>
-            <w:tcW w:w="3079" w:type="dxa"/>
-            <w:vAlign w:val="center"/>
-          </w:tcPr>
-          <w:p>
-            <w:pPr>
-              <w:spacing w:after="0" w:line="240" w:lineRule="auto"/>
-              <w:jc w:val="left"/>
-            </w:pPr>
-            <w:r>
-              <w:rPr>
-                <w:rFonts w:ascii="Times New Roman" w:hAnsi="Times New Roman" w:eastAsia="宋体"/>
-                <w:b w:val="0"/>
-                <w:sz w:val="18"/>
-              </w:rPr>
+              <w:t>系统加载已训练的MSCIM或CMFBE-ST-GCN模型权重和配置</w:t>
+            </w:r>
+          </w:p>
+        </w:tc>
+        <w:tc>
+          <w:tcPr>
+            <w:tcW w:w="3079" w:type="dxa"/>
+            <w:vAlign w:val="center"/>
+          </w:tcPr>
+          <w:p>
+            <w:pPr>
+              <w:spacing w:after="0" w:line="240" w:lineRule="auto"/>
+              <w:jc w:val="left"/>
+            </w:pPr>
+            <w:r>
               <w:t>模型运行实例</w:t>
             </w:r>
           </w:p>
@@ -4412,32 +4108,22 @@
               <w:jc w:val="left"/>
             </w:pPr>
             <w:r>
-              <w:rPr>
-                <w:rFonts w:ascii="Times New Roman" w:hAnsi="Times New Roman" w:eastAsia="宋体"/>
-                <w:b w:val="0"/>
-                <w:sz w:val="18"/>
-              </w:rPr>
-              <w:t>将多模态特征输入模型，输出浊度预测序列</w:t>
-            </w:r>
-          </w:p>
-        </w:tc>
-        <w:tc>
-          <w:tcPr>
-            <w:tcW w:w="3079" w:type="dxa"/>
-            <w:vAlign w:val="center"/>
-          </w:tcPr>
-          <w:p>
-            <w:pPr>
-              <w:spacing w:after="0" w:line="240" w:lineRule="auto"/>
-              <w:jc w:val="left"/>
-            </w:pPr>
-            <w:r>
-              <w:rPr>
-                <w:rFonts w:ascii="Times New Roman" w:hAnsi="Times New Roman" w:eastAsia="宋体"/>
-                <w:b w:val="0"/>
-                <w:sz w:val="18"/>
-              </w:rPr>
-              <w:t>预测浊度值</w:t>
+              <w:t>将多模态特征输入模型, 输出浊度与透明度预测序列</w:t>
+            </w:r>
+          </w:p>
+        </w:tc>
+        <w:tc>
+          <w:tcPr>
+            <w:tcW w:w="3079" w:type="dxa"/>
+            <w:vAlign w:val="center"/>
+          </w:tcPr>
+          <w:p>
+            <w:pPr>
+              <w:spacing w:after="0" w:line="240" w:lineRule="auto"/>
+              <w:jc w:val="left"/>
+            </w:pPr>
+            <w:r>
+              <w:t>预测浊度值、预测透明度值</w:t>
             </w:r>
           </w:p>
         </w:tc>
@@ -4493,32 +4179,22 @@
               <w:jc w:val="left"/>
             </w:pPr>
             <w:r>
-              <w:rPr>
-                <w:rFonts w:ascii="Times New Roman" w:hAnsi="Times New Roman" w:eastAsia="宋体"/>
-                <w:b w:val="0"/>
-                <w:sz w:val="18"/>
-              </w:rPr>
-              <w:t>将预测值与实测值在同一图表中展示，并计算误差指标</w:t>
-            </w:r>
-          </w:p>
-        </w:tc>
-        <w:tc>
-          <w:tcPr>
-            <w:tcW w:w="3079" w:type="dxa"/>
-            <w:vAlign w:val="center"/>
-          </w:tcPr>
-          <w:p>
-            <w:pPr>
-              <w:spacing w:after="0" w:line="240" w:lineRule="auto"/>
-              <w:jc w:val="left"/>
-            </w:pPr>
-            <w:r>
-              <w:rPr>
-                <w:rFonts w:ascii="Times New Roman" w:hAnsi="Times New Roman" w:eastAsia="宋体"/>
-                <w:b w:val="0"/>
-                <w:sz w:val="18"/>
-              </w:rPr>
-              <w:t>预测—实测对比图</w:t>
+              <w:t>将预测值与实测值在同一SVG图表中展示, 标注风险区间</w:t>
+            </w:r>
+          </w:p>
+        </w:tc>
+        <w:tc>
+          <w:tcPr>
+            <w:tcW w:w="3079" w:type="dxa"/>
+            <w:vAlign w:val="center"/>
+          </w:tcPr>
+          <w:p>
+            <w:pPr>
+              <w:spacing w:after="0" w:line="240" w:lineRule="auto"/>
+              <w:jc w:val="left"/>
+            </w:pPr>
+            <w:r>
+              <w:t>预测-实测对比图(含风险色带)</w:t>
             </w:r>
           </w:p>
         </w:tc>
@@ -4574,32 +4250,22 @@
               <w:jc w:val="left"/>
             </w:pPr>
             <w:r>
-              <w:rPr>
-                <w:rFonts w:ascii="Times New Roman" w:hAnsi="Times New Roman" w:eastAsia="宋体"/>
-                <w:b w:val="0"/>
-                <w:sz w:val="18"/>
-              </w:rPr>
-              <w:t>支持导出预测结果表、图表和分析报告</w:t>
-            </w:r>
-          </w:p>
-        </w:tc>
-        <w:tc>
-          <w:tcPr>
-            <w:tcW w:w="3079" w:type="dxa"/>
-            <w:vAlign w:val="center"/>
-          </w:tcPr>
-          <w:p>
-            <w:pPr>
-              <w:spacing w:after="0" w:line="240" w:lineRule="auto"/>
-              <w:jc w:val="left"/>
-            </w:pPr>
-            <w:r>
-              <w:rPr>
-                <w:rFonts w:ascii="Times New Roman" w:hAnsi="Times New Roman" w:eastAsia="宋体"/>
-                <w:b w:val="0"/>
-                <w:sz w:val="18"/>
-              </w:rPr>
-              <w:t>Excel/PDF/Word报告</w:t>
+              <w:t>支持导出HTML/Markdown/JSON/PDF格式的综合报告</w:t>
+            </w:r>
+          </w:p>
+        </w:tc>
+        <w:tc>
+          <w:tcPr>
+            <w:tcW w:w="3079" w:type="dxa"/>
+            <w:vAlign w:val="center"/>
+          </w:tcPr>
+          <w:p>
+            <w:pPr>
+              <w:spacing w:after="0" w:line="240" w:lineRule="auto"/>
+              <w:jc w:val="left"/>
+            </w:pPr>
+            <w:r>
+              <w:t>多格式分析报告</w:t>
             </w:r>
           </w:p>
         </w:tc>
@@ -4782,52 +4448,37 @@
               <w:jc w:val="left"/>
             </w:pPr>
             <w:r>
-              <w:rPr>
-                <w:rFonts w:ascii="Times New Roman" w:hAnsi="Times New Roman" w:eastAsia="宋体"/>
-                <w:b w:val="0"/>
-                <w:sz w:val="18"/>
-              </w:rPr>
-              <w:t>因子库管理</w:t>
-            </w:r>
-          </w:p>
-        </w:tc>
-        <w:tc>
-          <w:tcPr>
-            <w:tcW w:w="3079" w:type="dxa"/>
-            <w:vAlign w:val="center"/>
-          </w:tcPr>
-          <w:p>
-            <w:pPr>
-              <w:spacing w:after="0" w:line="240" w:lineRule="auto"/>
-              <w:jc w:val="left"/>
-            </w:pPr>
-            <w:r>
-              <w:rPr>
-                <w:rFonts w:ascii="Times New Roman" w:hAnsi="Times New Roman" w:eastAsia="宋体"/>
-                <w:b w:val="0"/>
-                <w:sz w:val="18"/>
-              </w:rPr>
-              <w:t>维护可能影响浊度的候选因子，包括水动力、气象、水文和人为调度等类别</w:t>
-            </w:r>
-          </w:p>
-        </w:tc>
-        <w:tc>
-          <w:tcPr>
-            <w:tcW w:w="3079" w:type="dxa"/>
-            <w:vAlign w:val="center"/>
-          </w:tcPr>
-          <w:p>
-            <w:pPr>
-              <w:spacing w:after="0" w:line="240" w:lineRule="auto"/>
-              <w:jc w:val="left"/>
-            </w:pPr>
-            <w:r>
-              <w:rPr>
-                <w:rFonts w:ascii="Times New Roman" w:hAnsi="Times New Roman" w:eastAsia="宋体"/>
-                <w:b w:val="0"/>
-                <w:sz w:val="18"/>
-              </w:rPr>
-              <w:t>致浊因子库</w:t>
+              <w:t>场景分诊</w:t>
+            </w:r>
+          </w:p>
+        </w:tc>
+        <w:tc>
+          <w:tcPr>
+            <w:tcW w:w="3079" w:type="dxa"/>
+            <w:vAlign w:val="center"/>
+          </w:tcPr>
+          <w:p>
+            <w:pPr>
+              <w:spacing w:after="0" w:line="240" w:lineRule="auto"/>
+              <w:jc w:val="left"/>
+            </w:pPr>
+            <w:r>
+              <w:t>将每日状态归类为external_input、internal_release、algal_dominant、chronic_composite四类场景</w:t>
+            </w:r>
+          </w:p>
+        </w:tc>
+        <w:tc>
+          <w:tcPr>
+            <w:tcW w:w="3079" w:type="dxa"/>
+            <w:vAlign w:val="center"/>
+          </w:tcPr>
+          <w:p>
+            <w:pPr>
+              <w:spacing w:after="0" w:line="240" w:lineRule="auto"/>
+              <w:jc w:val="left"/>
+            </w:pPr>
+            <w:r>
+              <w:t>场景分诊分类表</w:t>
             </w:r>
           </w:p>
         </w:tc>
@@ -4863,51 +4514,36 @@
               <w:jc w:val="left"/>
             </w:pPr>
             <w:r>
-              <w:rPr>
-                <w:rFonts w:ascii="Times New Roman" w:hAnsi="Times New Roman" w:eastAsia="宋体"/>
-                <w:b w:val="0"/>
-                <w:sz w:val="18"/>
-              </w:rPr>
-              <w:t>知识图谱构建</w:t>
-            </w:r>
-          </w:p>
-        </w:tc>
-        <w:tc>
-          <w:tcPr>
-            <w:tcW w:w="3079" w:type="dxa"/>
-            <w:vAlign w:val="center"/>
-          </w:tcPr>
-          <w:p>
-            <w:pPr>
-              <w:spacing w:after="0" w:line="240" w:lineRule="auto"/>
-              <w:jc w:val="left"/>
-            </w:pPr>
-            <w:r>
-              <w:rPr>
-                <w:rFonts w:ascii="Times New Roman" w:hAnsi="Times New Roman" w:eastAsia="宋体"/>
-                <w:b w:val="0"/>
-                <w:sz w:val="18"/>
-              </w:rPr>
-              <w:t>构建“因子—过程—指标—区域”之间的实体关系</w:t>
-            </w:r>
-          </w:p>
-        </w:tc>
-        <w:tc>
-          <w:tcPr>
-            <w:tcW w:w="3079" w:type="dxa"/>
-            <w:vAlign w:val="center"/>
-          </w:tcPr>
-          <w:p>
-            <w:pPr>
-              <w:spacing w:after="0" w:line="240" w:lineRule="auto"/>
-              <w:jc w:val="left"/>
-            </w:pPr>
-            <w:r>
-              <w:rPr>
-                <w:rFonts w:ascii="Times New Roman" w:hAnsi="Times New Roman" w:eastAsia="宋体"/>
-                <w:b w:val="0"/>
-                <w:sz w:val="18"/>
-              </w:rPr>
+              <w:t>知识图谱推理</w:t>
+            </w:r>
+          </w:p>
+        </w:tc>
+        <w:tc>
+          <w:tcPr>
+            <w:tcW w:w="3079" w:type="dxa"/>
+            <w:vAlign w:val="center"/>
+          </w:tcPr>
+          <w:p>
+            <w:pPr>
+              <w:spacing w:after="0" w:line="240" w:lineRule="auto"/>
+              <w:jc w:val="left"/>
+            </w:pPr>
+            <w:r>
+              <w:t>构建因子-过程-指标-区域实体关系, 辅助解释致浊机制</w:t>
+            </w:r>
+          </w:p>
+        </w:tc>
+        <w:tc>
+          <w:tcPr>
+            <w:tcW w:w="3079" w:type="dxa"/>
+            <w:vAlign w:val="center"/>
+          </w:tcPr>
+          <w:p>
+            <w:pPr>
+              <w:spacing w:after="0" w:line="240" w:lineRule="auto"/>
+              <w:jc w:val="left"/>
+            </w:pPr>
+            <w:r>
               <w:t>水体浊度知识图谱</w:t>
             </w:r>
           </w:p>
@@ -4944,11 +4580,6 @@
               <w:jc w:val="left"/>
             </w:pPr>
             <w:r>
-              <w:rPr>
-                <w:rFonts w:ascii="Times New Roman" w:hAnsi="Times New Roman" w:eastAsia="宋体"/>
-                <w:b w:val="0"/>
-                <w:sz w:val="18"/>
-              </w:rPr>
               <w:t>因果强度计算</w:t>
             </w:r>
           </w:p>
@@ -4964,32 +4595,22 @@
               <w:jc w:val="left"/>
             </w:pPr>
             <w:r>
-              <w:rPr>
-                <w:rFonts w:ascii="Times New Roman" w:hAnsi="Times New Roman" w:eastAsia="宋体"/>
-                <w:b w:val="0"/>
-                <w:sz w:val="18"/>
-              </w:rPr>
-              <w:t>根据历史数据和模型结果量化候选因子与浊度变化之间的影响强度</w:t>
-            </w:r>
-          </w:p>
-        </w:tc>
-        <w:tc>
-          <w:tcPr>
-            <w:tcW w:w="3079" w:type="dxa"/>
-            <w:vAlign w:val="center"/>
-          </w:tcPr>
-          <w:p>
-            <w:pPr>
-              <w:spacing w:after="0" w:line="240" w:lineRule="auto"/>
-              <w:jc w:val="left"/>
-            </w:pPr>
-            <w:r>
-              <w:rPr>
-                <w:rFonts w:ascii="Times New Roman" w:hAnsi="Times New Roman" w:eastAsia="宋体"/>
-                <w:b w:val="0"/>
-                <w:sz w:val="18"/>
-              </w:rPr>
-              <w:t>因子贡献度</w:t>
+              <w:t>根据历史数据和模型输出量化候选因子与浊度变化之间的影响强度</w:t>
+            </w:r>
+          </w:p>
+        </w:tc>
+        <w:tc>
+          <w:tcPr>
+            <w:tcW w:w="3079" w:type="dxa"/>
+            <w:vAlign w:val="center"/>
+          </w:tcPr>
+          <w:p>
+            <w:pPr>
+              <w:spacing w:after="0" w:line="240" w:lineRule="auto"/>
+              <w:jc w:val="left"/>
+            </w:pPr>
+            <w:r>
+              <w:t>因子贡献度排序</w:t>
             </w:r>
           </w:p>
         </w:tc>
@@ -5025,11 +4646,6 @@
               <w:jc w:val="left"/>
             </w:pPr>
             <w:r>
-              <w:rPr>
-                <w:rFonts w:ascii="Times New Roman" w:hAnsi="Times New Roman" w:eastAsia="宋体"/>
-                <w:b w:val="0"/>
-                <w:sz w:val="18"/>
-              </w:rPr>
               <w:t>主导因子识别</w:t>
             </w:r>
           </w:p>
@@ -5045,32 +4661,22 @@
               <w:jc w:val="left"/>
             </w:pPr>
             <w:r>
-              <w:rPr>
-                <w:rFonts w:ascii="Times New Roman" w:hAnsi="Times New Roman" w:eastAsia="宋体"/>
-                <w:b w:val="0"/>
-                <w:sz w:val="18"/>
-              </w:rPr>
-              <w:t>对候选因子进行排序，识别主导致浊因子和次要影响因子</w:t>
-            </w:r>
-          </w:p>
-        </w:tc>
-        <w:tc>
-          <w:tcPr>
-            <w:tcW w:w="3079" w:type="dxa"/>
-            <w:vAlign w:val="center"/>
-          </w:tcPr>
-          <w:p>
-            <w:pPr>
-              <w:spacing w:after="0" w:line="240" w:lineRule="auto"/>
-              <w:jc w:val="left"/>
-            </w:pPr>
-            <w:r>
-              <w:rPr>
-                <w:rFonts w:ascii="Times New Roman" w:hAnsi="Times New Roman" w:eastAsia="宋体"/>
-                <w:b w:val="0"/>
-                <w:sz w:val="18"/>
-              </w:rPr>
-              <w:t>因子排序列表</w:t>
+              <w:t>对候选因子排序, 识别主导致浊因子和次要影响因子; 输出主导过程分类</w:t>
+            </w:r>
+          </w:p>
+        </w:tc>
+        <w:tc>
+          <w:tcPr>
+            <w:tcW w:w="3079" w:type="dxa"/>
+            <w:vAlign w:val="center"/>
+          </w:tcPr>
+          <w:p>
+            <w:pPr>
+              <w:spacing w:after="0" w:line="240" w:lineRule="auto"/>
+              <w:jc w:val="left"/>
+            </w:pPr>
+            <w:r>
+              <w:t>主导致浊因子列表</w:t>
             </w:r>
           </w:p>
         </w:tc>
@@ -5106,11 +4712,6 @@
               <w:jc w:val="left"/>
             </w:pPr>
             <w:r>
-              <w:rPr>
-                <w:rFonts w:ascii="Times New Roman" w:hAnsi="Times New Roman" w:eastAsia="宋体"/>
-                <w:b w:val="0"/>
-                <w:sz w:val="18"/>
-              </w:rPr>
               <w:t>诊断报告生成</w:t>
             </w:r>
           </w:p>
@@ -5126,11 +4727,6 @@
               <w:jc w:val="left"/>
             </w:pPr>
             <w:r>
-              <w:rPr>
-                <w:rFonts w:ascii="Times New Roman" w:hAnsi="Times New Roman" w:eastAsia="宋体"/>
-                <w:b w:val="0"/>
-                <w:sz w:val="18"/>
-              </w:rPr>
               <w:t>输出浊度变化过程、主要原因、影响机制和建议关注指标</w:t>
             </w:r>
           </w:p>
@@ -5146,11 +4742,6 @@
               <w:jc w:val="left"/>
             </w:pPr>
             <w:r>
-              <w:rPr>
-                <w:rFonts w:ascii="Times New Roman" w:hAnsi="Times New Roman" w:eastAsia="宋体"/>
-                <w:b w:val="0"/>
-                <w:sz w:val="18"/>
-              </w:rPr>
               <w:t>归因诊断报告</w:t>
             </w:r>
           </w:p>
@@ -5357,32 +4948,22 @@
               <w:jc w:val="left"/>
             </w:pPr>
             <w:r>
-              <w:rPr>
-                <w:rFonts w:ascii="Times New Roman" w:hAnsi="Times New Roman" w:eastAsia="宋体"/>
-                <w:b w:val="0"/>
-                <w:sz w:val="18"/>
-              </w:rPr>
-              <w:t>站点编号、采样时间、水温、浊度、pH、电导率、溶解氧、悬浮物浓度</w:t>
-            </w:r>
-          </w:p>
-        </w:tc>
-        <w:tc>
-          <w:tcPr>
-            <w:tcW w:w="3079" w:type="dxa"/>
-            <w:vAlign w:val="center"/>
-          </w:tcPr>
-          <w:p>
-            <w:pPr>
-              <w:spacing w:after="0" w:line="240" w:lineRule="auto"/>
-              <w:jc w:val="left"/>
-            </w:pPr>
-            <w:r>
-              <w:rPr>
-                <w:rFonts w:ascii="Times New Roman" w:hAnsi="Times New Roman" w:eastAsia="宋体"/>
-                <w:b w:val="0"/>
-                <w:sz w:val="18"/>
-              </w:rPr>
-              <w:t>支撑水质状态展示和浊度预测建模</w:t>
+              <w:t>站点编号、采样时间、水温、浊度、pH、电导率、溶解氧、悬浮物浓度、透明度</w:t>
+            </w:r>
+          </w:p>
+        </w:tc>
+        <w:tc>
+          <w:tcPr>
+            <w:tcW w:w="3079" w:type="dxa"/>
+            <w:vAlign w:val="center"/>
+          </w:tcPr>
+          <w:p>
+            <w:pPr>
+              <w:spacing w:after="0" w:line="240" w:lineRule="auto"/>
+              <w:jc w:val="left"/>
+            </w:pPr>
+            <w:r>
+              <w:t>支撑水质状态展示和浊度/透明度预测建模</w:t>
             </w:r>
           </w:p>
         </w:tc>
@@ -5438,32 +5019,22 @@
               <w:jc w:val="left"/>
             </w:pPr>
             <w:r>
-              <w:rPr>
-                <w:rFonts w:ascii="Times New Roman" w:hAnsi="Times New Roman" w:eastAsia="宋体"/>
-                <w:b w:val="0"/>
-                <w:sz w:val="18"/>
-              </w:rPr>
-              <w:t>降雨量、风速、风向、气温、湿度、气压、太阳辐射</w:t>
-            </w:r>
-          </w:p>
-        </w:tc>
-        <w:tc>
-          <w:tcPr>
-            <w:tcW w:w="3079" w:type="dxa"/>
-            <w:vAlign w:val="center"/>
-          </w:tcPr>
-          <w:p>
-            <w:pPr>
-              <w:spacing w:after="0" w:line="240" w:lineRule="auto"/>
-              <w:jc w:val="left"/>
-            </w:pPr>
-            <w:r>
-              <w:rPr>
-                <w:rFonts w:ascii="Times New Roman" w:hAnsi="Times New Roman" w:eastAsia="宋体"/>
-                <w:b w:val="0"/>
-                <w:sz w:val="18"/>
-              </w:rPr>
-              <w:t>分析气象条件对浊度变化的影响</w:t>
+              <w:t>降雨量、风速、风向、气温、湿度、气压</w:t>
+            </w:r>
+          </w:p>
+        </w:tc>
+        <w:tc>
+          <w:tcPr>
+            <w:tcW w:w="3079" w:type="dxa"/>
+            <w:vAlign w:val="center"/>
+          </w:tcPr>
+          <w:p>
+            <w:pPr>
+              <w:spacing w:after="0" w:line="240" w:lineRule="auto"/>
+              <w:jc w:val="left"/>
+            </w:pPr>
+            <w:r>
+              <w:t>分析气象条件对浊度变化的驱动影响</w:t>
             </w:r>
           </w:p>
         </w:tc>
@@ -5519,32 +5090,22 @@
               <w:jc w:val="left"/>
             </w:pPr>
             <w:r>
-              <w:rPr>
-                <w:rFonts w:ascii="Times New Roman" w:hAnsi="Times New Roman" w:eastAsia="宋体"/>
-                <w:b w:val="0"/>
-                <w:sz w:val="18"/>
-              </w:rPr>
-              <w:t>流速、流量、水位、潮位、流向、径流量</w:t>
-            </w:r>
-          </w:p>
-        </w:tc>
-        <w:tc>
-          <w:tcPr>
-            <w:tcW w:w="3079" w:type="dxa"/>
-            <w:vAlign w:val="center"/>
-          </w:tcPr>
-          <w:p>
-            <w:pPr>
-              <w:spacing w:after="0" w:line="240" w:lineRule="auto"/>
-              <w:jc w:val="left"/>
-            </w:pPr>
-            <w:r>
-              <w:rPr>
-                <w:rFonts w:ascii="Times New Roman" w:hAnsi="Times New Roman" w:eastAsia="宋体"/>
-                <w:b w:val="0"/>
-                <w:sz w:val="18"/>
-              </w:rPr>
-              <w:t>表征水动力过程和河口交换过程</w:t>
+              <w:t>流速、流量、水位、潮位、径流量</w:t>
+            </w:r>
+          </w:p>
+        </w:tc>
+        <w:tc>
+          <w:tcPr>
+            <w:tcW w:w="3079" w:type="dxa"/>
+            <w:vAlign w:val="center"/>
+          </w:tcPr>
+          <w:p>
+            <w:pPr>
+              <w:spacing w:after="0" w:line="240" w:lineRule="auto"/>
+              <w:jc w:val="left"/>
+            </w:pPr>
+            <w:r>
+              <w:t>表征水动力过程和河口交换过程; 构造冲刷外输潜力等代理变量</w:t>
             </w:r>
           </w:p>
         </w:tc>
@@ -5600,31 +5161,21 @@
               <w:jc w:val="left"/>
             </w:pPr>
             <w:r>
-              <w:rPr>
-                <w:rFonts w:ascii="Times New Roman" w:hAnsi="Times New Roman" w:eastAsia="宋体"/>
-                <w:b w:val="0"/>
-                <w:sz w:val="18"/>
-              </w:rPr>
-              <w:t>闸门开度、调度时间、排水量、泵站运行状态</w:t>
-            </w:r>
-          </w:p>
-        </w:tc>
-        <w:tc>
-          <w:tcPr>
-            <w:tcW w:w="3079" w:type="dxa"/>
-            <w:vAlign w:val="center"/>
-          </w:tcPr>
-          <w:p>
-            <w:pPr>
-              <w:spacing w:after="0" w:line="240" w:lineRule="auto"/>
-              <w:jc w:val="left"/>
-            </w:pPr>
-            <w:r>
-              <w:rPr>
-                <w:rFonts w:ascii="Times New Roman" w:hAnsi="Times New Roman" w:eastAsia="宋体"/>
-                <w:b w:val="0"/>
-                <w:sz w:val="18"/>
-              </w:rPr>
+              <w:t>闸门开度、调度时间、排水量</w:t>
+            </w:r>
+          </w:p>
+        </w:tc>
+        <w:tc>
+          <w:tcPr>
+            <w:tcW w:w="3079" w:type="dxa"/>
+            <w:vAlign w:val="center"/>
+          </w:tcPr>
+          <w:p>
+            <w:pPr>
+              <w:spacing w:after="0" w:line="240" w:lineRule="auto"/>
+              <w:jc w:val="left"/>
+            </w:pPr>
+            <w:r>
               <w:t>分析工程调度对水体扰动和输移过程的影响</w:t>
             </w:r>
           </w:p>
@@ -5681,32 +5232,22 @@
               <w:jc w:val="left"/>
             </w:pPr>
             <w:r>
-              <w:rPr>
-                <w:rFonts w:ascii="Times New Roman" w:hAnsi="Times New Roman" w:eastAsia="宋体"/>
-                <w:b w:val="0"/>
-                <w:sz w:val="18"/>
-              </w:rPr>
-              <w:t>站点名称、经度、纬度、水域名称、行政区、断面类型</w:t>
-            </w:r>
-          </w:p>
-        </w:tc>
-        <w:tc>
-          <w:tcPr>
-            <w:tcW w:w="3079" w:type="dxa"/>
-            <w:vAlign w:val="center"/>
-          </w:tcPr>
-          <w:p>
-            <w:pPr>
-              <w:spacing w:after="0" w:line="240" w:lineRule="auto"/>
-              <w:jc w:val="left"/>
-            </w:pPr>
-            <w:r>
-              <w:rPr>
-                <w:rFonts w:ascii="Times New Roman" w:hAnsi="Times New Roman" w:eastAsia="宋体"/>
-                <w:b w:val="0"/>
-                <w:sz w:val="18"/>
-              </w:rPr>
-              <w:t>支撑地图展示、空间筛选和站点关联</w:t>
+              <w:t>站点名称、经度、纬度、水域名称、行政区划</w:t>
+            </w:r>
+          </w:p>
+        </w:tc>
+        <w:tc>
+          <w:tcPr>
+            <w:tcW w:w="3079" w:type="dxa"/>
+            <w:vAlign w:val="center"/>
+          </w:tcPr>
+          <w:p>
+            <w:pPr>
+              <w:spacing w:after="0" w:line="240" w:lineRule="auto"/>
+              <w:jc w:val="left"/>
+            </w:pPr>
+            <w:r>
+              <w:t>支撑站点空间关联和地图展示</w:t>
             </w:r>
           </w:p>
         </w:tc>
@@ -5916,12 +5457,7 @@
               <w:jc w:val="left"/>
             </w:pPr>
             <w:r>
-              <w:rPr>
-                <w:rFonts w:ascii="Times New Roman" w:hAnsi="Times New Roman" w:eastAsia="宋体"/>
-                <w:b w:val="0"/>
-                <w:sz w:val="18"/>
-              </w:rPr>
-              <w:t>站点编号、时间戳、浊度值等字段不得缺失</w:t>
+              <w:t>站点编号、时间戳、浊度值等核心字段不得缺失</w:t>
             </w:r>
           </w:p>
         </w:tc>
@@ -5997,12 +5533,7 @@
               <w:jc w:val="left"/>
             </w:pPr>
             <w:r>
-              <w:rPr>
-                <w:rFonts w:ascii="Times New Roman" w:hAnsi="Times New Roman" w:eastAsia="宋体"/>
-                <w:b w:val="0"/>
-                <w:sz w:val="18"/>
-              </w:rPr>
-              <w:t>保留最新记录或平均记录</w:t>
+              <w:t>保留最新记录或取平均值</w:t>
             </w:r>
           </w:p>
         </w:tc>
@@ -6078,11 +5609,6 @@
               <w:jc w:val="left"/>
             </w:pPr>
             <w:r>
-              <w:rPr>
-                <w:rFonts w:ascii="Times New Roman" w:hAnsi="Times New Roman" w:eastAsia="宋体"/>
-                <w:b w:val="0"/>
-                <w:sz w:val="18"/>
-              </w:rPr>
               <w:t>识别负值、越界值和短时间剧烈跳变</w:t>
             </w:r>
           </w:p>
@@ -6159,11 +5685,6 @@
               <w:jc w:val="left"/>
             </w:pPr>
             <w:r>
-              <w:rPr>
-                <w:rFonts w:ascii="Times New Roman" w:hAnsi="Times New Roman" w:eastAsia="宋体"/>
-                <w:b w:val="0"/>
-                <w:sz w:val="18"/>
-              </w:rPr>
               <w:t>将不同来源的数据转换为系统标准单位</w:t>
             </w:r>
           </w:p>
@@ -6240,11 +5761,6 @@
               <w:jc w:val="left"/>
             </w:pPr>
             <w:r>
-              <w:rPr>
-                <w:rFonts w:ascii="Times New Roman" w:hAnsi="Times New Roman" w:eastAsia="宋体"/>
-                <w:b w:val="0"/>
-                <w:sz w:val="18"/>
-              </w:rPr>
               <w:t>支撑日尺度连续监测记录构建</w:t>
             </w:r>
           </w:p>
@@ -6321,11 +5837,6 @@
               <w:jc w:val="left"/>
             </w:pPr>
             <w:r>
-              <w:rPr>
-                <w:rFonts w:ascii="Times New Roman" w:hAnsi="Times New Roman" w:eastAsia="宋体"/>
-                <w:b w:val="0"/>
-                <w:sz w:val="18"/>
-              </w:rPr>
               <w:t>避免站点归属错误影响空间分析</w:t>
             </w:r>
           </w:p>
@@ -6496,52 +6007,37 @@
               <w:jc w:val="left"/>
             </w:pPr>
             <w:r>
-              <w:rPr>
-                <w:rFonts w:ascii="Times New Roman" w:hAnsi="Times New Roman" w:eastAsia="宋体"/>
-                <w:b w:val="0"/>
-                <w:sz w:val="18"/>
-              </w:rPr>
-              <w:t>时序库</w:t>
-            </w:r>
-          </w:p>
-        </w:tc>
-        <w:tc>
-          <w:tcPr>
-            <w:tcW w:w="3079" w:type="dxa"/>
-            <w:vAlign w:val="center"/>
-          </w:tcPr>
-          <w:p>
-            <w:pPr>
-              <w:spacing w:after="0" w:line="240" w:lineRule="auto"/>
-              <w:jc w:val="left"/>
-            </w:pPr>
-            <w:r>
-              <w:rPr>
-                <w:rFonts w:ascii="Times New Roman" w:hAnsi="Times New Roman" w:eastAsia="宋体"/>
-                <w:b w:val="0"/>
-                <w:sz w:val="18"/>
-              </w:rPr>
-              <w:t>水质、气象、水文等连续监测序列</w:t>
-            </w:r>
-          </w:p>
-        </w:tc>
-        <w:tc>
-          <w:tcPr>
-            <w:tcW w:w="3079" w:type="dxa"/>
-            <w:vAlign w:val="center"/>
-          </w:tcPr>
-          <w:p>
-            <w:pPr>
-              <w:spacing w:after="0" w:line="240" w:lineRule="auto"/>
-              <w:jc w:val="left"/>
-            </w:pPr>
-            <w:r>
-              <w:rPr>
-                <w:rFonts w:ascii="Times New Roman" w:hAnsi="Times New Roman" w:eastAsia="宋体"/>
-                <w:b w:val="0"/>
-                <w:sz w:val="18"/>
-              </w:rPr>
-              <w:t>turbidity_series、weather_series、hydrology_series</w:t>
+              <w:t>文件系统存储</w:t>
+            </w:r>
+          </w:p>
+        </w:tc>
+        <w:tc>
+          <w:tcPr>
+            <w:tcW w:w="3079" w:type="dxa"/>
+            <w:vAlign w:val="center"/>
+          </w:tcPr>
+          <w:p>
+            <w:pPr>
+              <w:spacing w:after="0" w:line="240" w:lineRule="auto"/>
+              <w:jc w:val="left"/>
+            </w:pPr>
+            <w:r>
+              <w:t>预测产物(CSV/JSON)、图表(PNG)、诊断报告(HTML/MD/JSON/PDF)、模型参数文件</w:t>
+            </w:r>
+          </w:p>
+        </w:tc>
+        <w:tc>
+          <w:tcPr>
+            <w:tcW w:w="3079" w:type="dxa"/>
+            <w:vAlign w:val="center"/>
+          </w:tcPr>
+          <w:p>
+            <w:pPr>
+              <w:spacing w:after="0" w:line="240" w:lineRule="auto"/>
+              <w:jc w:val="left"/>
+            </w:pPr>
+            <w:r>
+              <w:t>outputs/predictions/、outputs/plots/、outputs/diagnosis/、outputs/models/</w:t>
             </w:r>
           </w:p>
         </w:tc>
@@ -6577,52 +6073,37 @@
               <w:jc w:val="left"/>
             </w:pPr>
             <w:r>
-              <w:rPr>
-                <w:rFonts w:ascii="Times New Roman" w:hAnsi="Times New Roman" w:eastAsia="宋体"/>
-                <w:b w:val="0"/>
-                <w:sz w:val="18"/>
-              </w:rPr>
-              <w:t>关系库</w:t>
-            </w:r>
-          </w:p>
-        </w:tc>
-        <w:tc>
-          <w:tcPr>
-            <w:tcW w:w="3079" w:type="dxa"/>
-            <w:vAlign w:val="center"/>
-          </w:tcPr>
-          <w:p>
-            <w:pPr>
-              <w:spacing w:after="0" w:line="240" w:lineRule="auto"/>
-              <w:jc w:val="left"/>
-            </w:pPr>
-            <w:r>
-              <w:rPr>
-                <w:rFonts w:ascii="Times New Roman" w:hAnsi="Times New Roman" w:eastAsia="宋体"/>
-                <w:b w:val="0"/>
-                <w:sz w:val="18"/>
-              </w:rPr>
-              <w:t>用户、站点、预测任务、模型版本、报告记录</w:t>
-            </w:r>
-          </w:p>
-        </w:tc>
-        <w:tc>
-          <w:tcPr>
-            <w:tcW w:w="3079" w:type="dxa"/>
-            <w:vAlign w:val="center"/>
-          </w:tcPr>
-          <w:p>
-            <w:pPr>
-              <w:spacing w:after="0" w:line="240" w:lineRule="auto"/>
-              <w:jc w:val="left"/>
-            </w:pPr>
-            <w:r>
-              <w:rPr>
-                <w:rFonts w:ascii="Times New Roman" w:hAnsi="Times New Roman" w:eastAsia="宋体"/>
-                <w:b w:val="0"/>
-                <w:sz w:val="18"/>
-              </w:rPr>
-              <w:t>user_info、station_info、prediction_task、model_version、report_record</w:t>
+              <w:t>SQLite状态库</w:t>
+            </w:r>
+          </w:p>
+        </w:tc>
+        <w:tc>
+          <w:tcPr>
+            <w:tcW w:w="3079" w:type="dxa"/>
+            <w:vAlign w:val="center"/>
+          </w:tcPr>
+          <w:p>
+            <w:pPr>
+              <w:spacing w:after="0" w:line="240" w:lineRule="auto"/>
+              <w:jc w:val="left"/>
+            </w:pPr>
+            <w:r>
+              <w:t>用户会话、导入记录、预测任务状态、任务日志</w:t>
+            </w:r>
+          </w:p>
+        </w:tc>
+        <w:tc>
+          <w:tcPr>
+            <w:tcW w:w="3079" w:type="dxa"/>
+            <w:vAlign w:val="center"/>
+          </w:tcPr>
+          <w:p>
+            <w:pPr>
+              <w:spacing w:after="0" w:line="240" w:lineRule="auto"/>
+              <w:jc w:val="left"/>
+            </w:pPr>
+            <w:r>
+              <w:t>app_state.sqlite3(user_session、import_record、prediction_job等)</w:t>
             </w:r>
           </w:p>
         </w:tc>
@@ -6658,52 +6139,37 @@
               <w:jc w:val="left"/>
             </w:pPr>
             <w:r>
-              <w:rPr>
-                <w:rFonts w:ascii="Times New Roman" w:hAnsi="Times New Roman" w:eastAsia="宋体"/>
-                <w:b w:val="0"/>
-                <w:sz w:val="18"/>
-              </w:rPr>
-              <w:t>图数据库</w:t>
-            </w:r>
-          </w:p>
-        </w:tc>
-        <w:tc>
-          <w:tcPr>
-            <w:tcW w:w="3079" w:type="dxa"/>
-            <w:vAlign w:val="center"/>
-          </w:tcPr>
-          <w:p>
-            <w:pPr>
-              <w:spacing w:after="0" w:line="240" w:lineRule="auto"/>
-              <w:jc w:val="left"/>
-            </w:pPr>
-            <w:r>
-              <w:rPr>
-                <w:rFonts w:ascii="Times New Roman" w:hAnsi="Times New Roman" w:eastAsia="宋体"/>
-                <w:b w:val="0"/>
-                <w:sz w:val="18"/>
-              </w:rPr>
-              <w:t>致浊因子、影响过程、指标关系、区域关系</w:t>
-            </w:r>
-          </w:p>
-        </w:tc>
-        <w:tc>
-          <w:tcPr>
-            <w:tcW w:w="3079" w:type="dxa"/>
-            <w:vAlign w:val="center"/>
-          </w:tcPr>
-          <w:p>
-            <w:pPr>
-              <w:spacing w:after="0" w:line="240" w:lineRule="auto"/>
-              <w:jc w:val="left"/>
-            </w:pPr>
-            <w:r>
-              <w:rPr>
-                <w:rFonts w:ascii="Times New Roman" w:hAnsi="Times New Roman" w:eastAsia="宋体"/>
-                <w:b w:val="0"/>
-                <w:sz w:val="18"/>
-              </w:rPr>
-              <w:t>Factor、Process、Indicator、Region、Station</w:t>
+              <w:t>知识图谱文件</w:t>
+            </w:r>
+          </w:p>
+        </w:tc>
+        <w:tc>
+          <w:tcPr>
+            <w:tcW w:w="3079" w:type="dxa"/>
+            <w:vAlign w:val="center"/>
+          </w:tcPr>
+          <w:p>
+            <w:pPr>
+              <w:spacing w:after="0" w:line="240" w:lineRule="auto"/>
+              <w:jc w:val="left"/>
+            </w:pPr>
+            <w:r>
+              <w:t>致浊因子、影响过程、指标关系、区域关联的JSON关系图</w:t>
+            </w:r>
+          </w:p>
+        </w:tc>
+        <w:tc>
+          <w:tcPr>
+            <w:tcW w:w="3079" w:type="dxa"/>
+            <w:vAlign w:val="center"/>
+          </w:tcPr>
+          <w:p>
+            <w:pPr>
+              <w:spacing w:after="0" w:line="240" w:lineRule="auto"/>
+              <w:jc w:val="left"/>
+            </w:pPr>
+            <w:r>
+              <w:t>data/knowledge_graph/、outputs/agent/</w:t>
             </w:r>
           </w:p>
         </w:tc>
@@ -6915,31 +6381,21 @@
               <w:jc w:val="left"/>
             </w:pPr>
             <w:r>
-              <w:rPr>
-                <w:rFonts w:ascii="Times New Roman" w:hAnsi="Times New Roman" w:eastAsia="宋体"/>
-                <w:b w:val="0"/>
-                <w:sz w:val="18"/>
-              </w:rPr>
-              <w:t>读取水质、气象、水文、水利和空间特征</w:t>
-            </w:r>
-          </w:p>
-        </w:tc>
-        <w:tc>
-          <w:tcPr>
-            <w:tcW w:w="3079" w:type="dxa"/>
-            <w:vAlign w:val="center"/>
-          </w:tcPr>
-          <w:p>
-            <w:pPr>
-              <w:spacing w:after="0" w:line="240" w:lineRule="auto"/>
-              <w:jc w:val="left"/>
-            </w:pPr>
-            <w:r>
-              <w:rPr>
-                <w:rFonts w:ascii="Times New Roman" w:hAnsi="Times New Roman" w:eastAsia="宋体"/>
-                <w:b w:val="0"/>
-                <w:sz w:val="18"/>
-              </w:rPr>
+              <w:t>读取水质、气象、水文特征; 加载知识图谱先验邻接矩阵</w:t>
+            </w:r>
+          </w:p>
+        </w:tc>
+        <w:tc>
+          <w:tcPr>
+            <w:tcW w:w="3079" w:type="dxa"/>
+            <w:vAlign w:val="center"/>
+          </w:tcPr>
+          <w:p>
+            <w:pPr>
+              <w:spacing w:after="0" w:line="240" w:lineRule="auto"/>
+              <w:jc w:val="left"/>
+            </w:pPr>
+            <w:r>
               <w:t>模型输入样本</w:t>
             </w:r>
           </w:p>
@@ -6996,32 +6452,22 @@
               <w:jc w:val="left"/>
             </w:pPr>
             <w:r>
-              <w:rPr>
-                <w:rFonts w:ascii="Times New Roman" w:hAnsi="Times New Roman" w:eastAsia="宋体"/>
-                <w:b w:val="0"/>
-                <w:sz w:val="18"/>
-              </w:rPr>
-              <w:t>归一化、滞后项构造、滑动窗口统计、缺失值补全</w:t>
-            </w:r>
-          </w:p>
-        </w:tc>
-        <w:tc>
-          <w:tcPr>
-            <w:tcW w:w="3079" w:type="dxa"/>
-            <w:vAlign w:val="center"/>
-          </w:tcPr>
-          <w:p>
-            <w:pPr>
-              <w:spacing w:after="0" w:line="240" w:lineRule="auto"/>
-              <w:jc w:val="left"/>
-            </w:pPr>
-            <w:r>
-              <w:rPr>
-                <w:rFonts w:ascii="Times New Roman" w:hAnsi="Times New Roman" w:eastAsia="宋体"/>
-                <w:b w:val="0"/>
-                <w:sz w:val="18"/>
-              </w:rPr>
-              <w:t>特征矩阵</w:t>
+              <w:t>归一化、滞后项构造(1-7天)、滑动窗口统计量、缺失值补全</w:t>
+            </w:r>
+          </w:p>
+        </w:tc>
+        <w:tc>
+          <w:tcPr>
+            <w:tcW w:w="3079" w:type="dxa"/>
+            <w:vAlign w:val="center"/>
+          </w:tcPr>
+          <w:p>
+            <w:pPr>
+              <w:spacing w:after="0" w:line="240" w:lineRule="auto"/>
+              <w:jc w:val="left"/>
+            </w:pPr>
+            <w:r>
+              <w:t>多模态特征矩阵</w:t>
             </w:r>
           </w:p>
         </w:tc>
@@ -7077,31 +6523,21 @@
               <w:jc w:val="left"/>
             </w:pPr>
             <w:r>
-              <w:rPr>
-                <w:rFonts w:ascii="Times New Roman" w:hAnsi="Times New Roman" w:eastAsia="宋体"/>
-                <w:b w:val="0"/>
-                <w:sz w:val="18"/>
-              </w:rPr>
-              <w:t>整合同一时间窗口下的多模态数据</w:t>
-            </w:r>
-          </w:p>
-        </w:tc>
-        <w:tc>
-          <w:tcPr>
-            <w:tcW w:w="3079" w:type="dxa"/>
-            <w:vAlign w:val="center"/>
-          </w:tcPr>
-          <w:p>
-            <w:pPr>
-              <w:spacing w:after="0" w:line="240" w:lineRule="auto"/>
-              <w:jc w:val="left"/>
-            </w:pPr>
-            <w:r>
-              <w:rPr>
-                <w:rFonts w:ascii="Times New Roman" w:hAnsi="Times New Roman" w:eastAsia="宋体"/>
-                <w:b w:val="0"/>
-                <w:sz w:val="18"/>
-              </w:rPr>
+              <w:t>位置感知时序Transformer编码器 + 知识图谱先验图卷积</w:t>
+            </w:r>
+          </w:p>
+        </w:tc>
+        <w:tc>
+          <w:tcPr>
+            <w:tcW w:w="3079" w:type="dxa"/>
+            <w:vAlign w:val="center"/>
+          </w:tcPr>
+          <w:p>
+            <w:pPr>
+              <w:spacing w:after="0" w:line="240" w:lineRule="auto"/>
+              <w:jc w:val="left"/>
+            </w:pPr>
+            <w:r>
               <w:t>融合特征表示</w:t>
             </w:r>
           </w:p>
@@ -7158,32 +6594,22 @@
               <w:jc w:val="left"/>
             </w:pPr>
             <w:r>
-              <w:rPr>
-                <w:rFonts w:ascii="Times New Roman" w:hAnsi="Times New Roman" w:eastAsia="宋体"/>
-                <w:b w:val="0"/>
-                <w:sz w:val="18"/>
-              </w:rPr>
-              <w:t>调用MSCIM模型输出浊度预测值</w:t>
-            </w:r>
-          </w:p>
-        </w:tc>
-        <w:tc>
-          <w:tcPr>
-            <w:tcW w:w="3079" w:type="dxa"/>
-            <w:vAlign w:val="center"/>
-          </w:tcPr>
-          <w:p>
-            <w:pPr>
-              <w:spacing w:after="0" w:line="240" w:lineRule="auto"/>
-              <w:jc w:val="left"/>
-            </w:pPr>
-            <w:r>
-              <w:rPr>
-                <w:rFonts w:ascii="Times New Roman" w:hAnsi="Times New Roman" w:eastAsia="宋体"/>
-                <w:b w:val="0"/>
-                <w:sz w:val="18"/>
-              </w:rPr>
-              <w:t>预测序列</w:t>
+              <w:t>调用MSCIM或CMFBE-ST-GCN模型输出浊度与透明度预测值</w:t>
+            </w:r>
+          </w:p>
+        </w:tc>
+        <w:tc>
+          <w:tcPr>
+            <w:tcW w:w="3079" w:type="dxa"/>
+            <w:vAlign w:val="center"/>
+          </w:tcPr>
+          <w:p>
+            <w:pPr>
+              <w:spacing w:after="0" w:line="240" w:lineRule="auto"/>
+              <w:jc w:val="left"/>
+            </w:pPr>
+            <w:r>
+              <w:t>预测序列(浊度+透明度代理)</w:t>
             </w:r>
           </w:p>
         </w:tc>
@@ -7239,31 +6665,21 @@
               <w:jc w:val="left"/>
             </w:pPr>
             <w:r>
-              <w:rPr>
-                <w:rFonts w:ascii="Times New Roman" w:hAnsi="Times New Roman" w:eastAsia="宋体"/>
-                <w:b w:val="0"/>
-                <w:sz w:val="18"/>
-              </w:rPr>
-              <w:t>计算预测误差并与实测值对比</w:t>
-            </w:r>
-          </w:p>
-        </w:tc>
-        <w:tc>
-          <w:tcPr>
-            <w:tcW w:w="3079" w:type="dxa"/>
-            <w:vAlign w:val="center"/>
-          </w:tcPr>
-          <w:p>
-            <w:pPr>
-              <w:spacing w:after="0" w:line="240" w:lineRule="auto"/>
-              <w:jc w:val="left"/>
-            </w:pPr>
-            <w:r>
-              <w:rPr>
-                <w:rFonts w:ascii="Times New Roman" w:hAnsi="Times New Roman" w:eastAsia="宋体"/>
-                <w:b w:val="0"/>
-                <w:sz w:val="18"/>
-              </w:rPr>
+              <w:t>计算R squared/MAE/RMSE并与基线模型(持久性预测)对比</w:t>
+            </w:r>
+          </w:p>
+        </w:tc>
+        <w:tc>
+          <w:tcPr>
+            <w:tcW w:w="3079" w:type="dxa"/>
+            <w:vAlign w:val="center"/>
+          </w:tcPr>
+          <w:p>
+            <w:pPr>
+              <w:spacing w:after="0" w:line="240" w:lineRule="auto"/>
+              <w:jc w:val="left"/>
+            </w:pPr>
+            <w:r>
               <w:t>评估指标与对比图</w:t>
             </w:r>
           </w:p>
@@ -7454,32 +6870,22 @@
               <w:jc w:val="left"/>
             </w:pPr>
             <w:r>
-              <w:rPr>
-                <w:rFonts w:ascii="Times New Roman" w:hAnsi="Times New Roman" w:eastAsia="宋体"/>
-                <w:b w:val="0"/>
-                <w:sz w:val="18"/>
-              </w:rPr>
-              <w:t>选择历史样本、训练区间和验证区间</w:t>
-            </w:r>
-          </w:p>
-        </w:tc>
-        <w:tc>
-          <w:tcPr>
-            <w:tcW w:w="3079" w:type="dxa"/>
-            <w:vAlign w:val="center"/>
-          </w:tcPr>
-          <w:p>
-            <w:pPr>
-              <w:spacing w:after="0" w:line="240" w:lineRule="auto"/>
-              <w:jc w:val="left"/>
-            </w:pPr>
-            <w:r>
-              <w:rPr>
-                <w:rFonts w:ascii="Times New Roman" w:hAnsi="Times New Roman" w:eastAsia="宋体"/>
-                <w:b w:val="0"/>
-                <w:sz w:val="18"/>
-              </w:rPr>
-              <w:t>选择目标站点、预测区间和输入数据</w:t>
+              <w:t>选择训练/验证/测试数据集和输入特征列表</w:t>
+            </w:r>
+          </w:p>
+        </w:tc>
+        <w:tc>
+          <w:tcPr>
+            <w:tcW w:w="3079" w:type="dxa"/>
+            <w:vAlign w:val="center"/>
+          </w:tcPr>
+          <w:p>
+            <w:pPr>
+              <w:spacing w:after="0" w:line="240" w:lineRule="auto"/>
+              <w:jc w:val="left"/>
+            </w:pPr>
+            <w:r>
+              <w:t>选择目标站点、预测区间和模型版本</w:t>
             </w:r>
           </w:p>
         </w:tc>
@@ -7535,32 +6941,22 @@
               <w:jc w:val="left"/>
             </w:pPr>
             <w:r>
-              <w:rPr>
-                <w:rFonts w:ascii="Times New Roman" w:hAnsi="Times New Roman" w:eastAsia="宋体"/>
-                <w:b w:val="0"/>
-                <w:sz w:val="18"/>
-              </w:rPr>
-              <w:t>执行清洗、对齐、特征构建和标准化</w:t>
-            </w:r>
-          </w:p>
-        </w:tc>
-        <w:tc>
-          <w:tcPr>
-            <w:tcW w:w="3079" w:type="dxa"/>
-            <w:vAlign w:val="center"/>
-          </w:tcPr>
-          <w:p>
-            <w:pPr>
-              <w:spacing w:after="0" w:line="240" w:lineRule="auto"/>
-              <w:jc w:val="left"/>
-            </w:pPr>
-            <w:r>
-              <w:rPr>
-                <w:rFonts w:ascii="Times New Roman" w:hAnsi="Times New Roman" w:eastAsia="宋体"/>
-                <w:b w:val="0"/>
-                <w:sz w:val="18"/>
-              </w:rPr>
-              <w:t>执行同训练阶段一致的特征处理</w:t>
+              <w:t>执行清洗、对齐、特征构建、标准化</w:t>
+            </w:r>
+          </w:p>
+        </w:tc>
+        <w:tc>
+          <w:tcPr>
+            <w:tcW w:w="3079" w:type="dxa"/>
+            <w:vAlign w:val="center"/>
+          </w:tcPr>
+          <w:p>
+            <w:pPr>
+              <w:spacing w:after="0" w:line="240" w:lineRule="auto"/>
+              <w:jc w:val="left"/>
+            </w:pPr>
+            <w:r>
+              <w:t>执行同训练阶段一致的特征处理流程</w:t>
             </w:r>
           </w:p>
         </w:tc>
@@ -7616,32 +7012,22 @@
               <w:jc w:val="left"/>
             </w:pPr>
             <w:r>
-              <w:rPr>
-                <w:rFonts w:ascii="Times New Roman" w:hAnsi="Times New Roman" w:eastAsia="宋体"/>
-                <w:b w:val="0"/>
-                <w:sz w:val="18"/>
-              </w:rPr>
-              <w:t>训练MSCIM模型并保存参数</w:t>
-            </w:r>
-          </w:p>
-        </w:tc>
-        <w:tc>
-          <w:tcPr>
-            <w:tcW w:w="3079" w:type="dxa"/>
-            <w:vAlign w:val="center"/>
-          </w:tcPr>
-          <w:p>
-            <w:pPr>
-              <w:spacing w:after="0" w:line="240" w:lineRule="auto"/>
-              <w:jc w:val="left"/>
-            </w:pPr>
-            <w:r>
-              <w:rPr>
-                <w:rFonts w:ascii="Times New Roman" w:hAnsi="Times New Roman" w:eastAsia="宋体"/>
-                <w:b w:val="0"/>
-                <w:sz w:val="18"/>
-              </w:rPr>
-              <w:t>加载指定版本MSCIM模型</w:t>
+              <w:t>训练MSCIM/CMFBE模型并保存参数与配置</w:t>
+            </w:r>
+          </w:p>
+        </w:tc>
+        <w:tc>
+          <w:tcPr>
+            <w:tcW w:w="3079" w:type="dxa"/>
+            <w:vAlign w:val="center"/>
+          </w:tcPr>
+          <w:p>
+            <w:pPr>
+              <w:spacing w:after="0" w:line="240" w:lineRule="auto"/>
+              <w:jc w:val="left"/>
+            </w:pPr>
+            <w:r>
+              <w:t>加载指定版本模型权重并执行推理</w:t>
             </w:r>
           </w:p>
         </w:tc>
@@ -7697,32 +7083,22 @@
               <w:jc w:val="left"/>
             </w:pPr>
             <w:r>
-              <w:rPr>
-                <w:rFonts w:ascii="Times New Roman" w:hAnsi="Times New Roman" w:eastAsia="宋体"/>
-                <w:b w:val="0"/>
-                <w:sz w:val="18"/>
-              </w:rPr>
-              <w:t>输出训练误差、验证误差和模型文件</w:t>
-            </w:r>
-          </w:p>
-        </w:tc>
-        <w:tc>
-          <w:tcPr>
-            <w:tcW w:w="3079" w:type="dxa"/>
-            <w:vAlign w:val="center"/>
-          </w:tcPr>
-          <w:p>
-            <w:pPr>
-              <w:spacing w:after="0" w:line="240" w:lineRule="auto"/>
-              <w:jc w:val="left"/>
-            </w:pPr>
-            <w:r>
-              <w:rPr>
-                <w:rFonts w:ascii="Times New Roman" w:hAnsi="Times New Roman" w:eastAsia="宋体"/>
-                <w:b w:val="0"/>
-                <w:sz w:val="18"/>
-              </w:rPr>
-              <w:t>输出预测值、对比图和预测报告</w:t>
+              <w:t>输出训练误差、验证误差、模型文件和评估报告</w:t>
+            </w:r>
+          </w:p>
+        </w:tc>
+        <w:tc>
+          <w:tcPr>
+            <w:tcW w:w="3079" w:type="dxa"/>
+            <w:vAlign w:val="center"/>
+          </w:tcPr>
+          <w:p>
+            <w:pPr>
+              <w:spacing w:after="0" w:line="240" w:lineRule="auto"/>
+              <w:jc w:val="left"/>
+            </w:pPr>
+            <w:r>
+              <w:t>输出预测值、对比图、场景分诊和诊断报告</w:t>
             </w:r>
           </w:p>
         </w:tc>
@@ -7932,11 +7308,6 @@
               <w:jc w:val="left"/>
             </w:pPr>
             <w:r>
-              <w:rPr>
-                <w:rFonts w:ascii="Times New Roman" w:hAnsi="Times New Roman" w:eastAsia="宋体"/>
-                <w:b w:val="0"/>
-                <w:sz w:val="18"/>
-              </w:rPr>
               <w:t>衡量预测值与实测值的平均偏差</w:t>
             </w:r>
           </w:p>
@@ -8013,12 +7384,7 @@
               <w:jc w:val="left"/>
             </w:pPr>
             <w:r>
-              <w:rPr>
-                <w:rFonts w:ascii="Times New Roman" w:hAnsi="Times New Roman" w:eastAsia="宋体"/>
-                <w:b w:val="0"/>
-                <w:sz w:val="18"/>
-              </w:rPr>
-              <w:t>对较大误差更敏感，适合识别突变时段预测偏差</w:t>
+              <w:t>对较大误差更敏感, 适合识别突变时段预测偏差</w:t>
             </w:r>
           </w:p>
         </w:tc>
@@ -8094,12 +7460,7 @@
               <w:jc w:val="left"/>
             </w:pPr>
             <w:r>
-              <w:rPr>
-                <w:rFonts w:ascii="Times New Roman" w:hAnsi="Times New Roman" w:eastAsia="宋体"/>
-                <w:b w:val="0"/>
-                <w:sz w:val="18"/>
-              </w:rPr>
-              <w:t>衡量模型对浊度变化的解释能力</w:t>
+              <w:t>衡量模型对浊度/透明度变化的解释能力(当前MSCIM浊度R squared=0.7735)</w:t>
             </w:r>
           </w:p>
         </w:tc>
@@ -8175,11 +7536,6 @@
               <w:jc w:val="left"/>
             </w:pPr>
             <w:r>
-              <w:rPr>
-                <w:rFonts w:ascii="Times New Roman" w:hAnsi="Times New Roman" w:eastAsia="宋体"/>
-                <w:b w:val="0"/>
-                <w:sz w:val="18"/>
-              </w:rPr>
               <w:t>用于比较不同站点或不同量级数据的相对误差</w:t>
             </w:r>
           </w:p>
@@ -8379,12 +7735,7 @@
               <w:jc w:val="left"/>
             </w:pPr>
             <w:r>
-              <w:rPr>
-                <w:rFonts w:ascii="Times New Roman" w:hAnsi="Times New Roman" w:eastAsia="宋体"/>
-                <w:b w:val="0"/>
-                <w:sz w:val="18"/>
-              </w:rPr>
-              <w:t>用户管理、数据源管理、模型管理、系统配置、全部数据访问</w:t>
+              <w:t>用户管理、系统配置、全部数据访问</w:t>
             </w:r>
           </w:p>
         </w:tc>
@@ -8460,12 +7811,7 @@
               <w:jc w:val="left"/>
             </w:pPr>
             <w:r>
-              <w:rPr>
-                <w:rFonts w:ascii="Times New Roman" w:hAnsi="Times New Roman" w:eastAsia="宋体"/>
-                <w:b w:val="0"/>
-                <w:sz w:val="18"/>
-              </w:rPr>
-              <w:t>数据查询、预测任务、可视化分析、报告生成</w:t>
+              <w:t>数据查询与上传、预测任务创建与管理、可视化分析、报告生成与导出</w:t>
             </w:r>
           </w:p>
         </w:tc>
@@ -8541,12 +7887,7 @@
               <w:jc w:val="left"/>
             </w:pPr>
             <w:r>
-              <w:rPr>
-                <w:rFonts w:ascii="Times New Roman" w:hAnsi="Times New Roman" w:eastAsia="宋体"/>
-                <w:b w:val="0"/>
-                <w:sz w:val="18"/>
-              </w:rPr>
-              <w:t>看板查看、部分查询、报告浏览</w:t>
+              <w:t>看板查看、部分数据查询、报告浏览</w:t>
             </w:r>
           </w:p>
         </w:tc>
@@ -8853,32 +8194,22 @@
               <w:jc w:val="left"/>
             </w:pPr>
             <w:r>
-              <w:rPr>
-                <w:rFonts w:ascii="Times New Roman" w:hAnsi="Times New Roman" w:eastAsia="宋体"/>
-                <w:b w:val="0"/>
-                <w:sz w:val="18"/>
-              </w:rPr>
-              <w:t>拒绝导入并提示支持格式</w:t>
-            </w:r>
-          </w:p>
-        </w:tc>
-        <w:tc>
-          <w:tcPr>
-            <w:tcW w:w="3079" w:type="dxa"/>
-            <w:vAlign w:val="center"/>
-          </w:tcPr>
-          <w:p>
-            <w:pPr>
-              <w:spacing w:after="0" w:line="240" w:lineRule="auto"/>
-              <w:jc w:val="left"/>
-            </w:pPr>
-            <w:r>
-              <w:rPr>
-                <w:rFonts w:ascii="Times New Roman" w:hAnsi="Times New Roman" w:eastAsia="宋体"/>
-                <w:b w:val="0"/>
-                <w:sz w:val="18"/>
-              </w:rPr>
-              <w:t>文件格式不符合要求，请上传CSV或Excel文件</w:t>
+              <w:t>拒绝导入并提示支持的格式</w:t>
+            </w:r>
+          </w:p>
+        </w:tc>
+        <w:tc>
+          <w:tcPr>
+            <w:tcW w:w="3079" w:type="dxa"/>
+            <w:vAlign w:val="center"/>
+          </w:tcPr>
+          <w:p>
+            <w:pPr>
+              <w:spacing w:after="0" w:line="240" w:lineRule="auto"/>
+              <w:jc w:val="left"/>
+            </w:pPr>
+            <w:r>
+              <w:t>文件格式不符合要求, 请上传CSV或Excel文件</w:t>
             </w:r>
           </w:p>
         </w:tc>
@@ -8934,11 +8265,6 @@
               <w:jc w:val="left"/>
             </w:pPr>
             <w:r>
-              <w:rPr>
-                <w:rFonts w:ascii="Times New Roman" w:hAnsi="Times New Roman" w:eastAsia="宋体"/>
-                <w:b w:val="0"/>
-                <w:sz w:val="18"/>
-              </w:rPr>
               <w:t>中断导入并列出缺失字段</w:t>
             </w:r>
           </w:p>
@@ -8954,11 +8280,6 @@
               <w:jc w:val="left"/>
             </w:pPr>
             <w:r>
-              <w:rPr>
-                <w:rFonts w:ascii="Times New Roman" w:hAnsi="Times New Roman" w:eastAsia="宋体"/>
-                <w:b w:val="0"/>
-                <w:sz w:val="18"/>
-              </w:rPr>
               <w:t>缺少站点编号、采样时间或浊度字段</w:t>
             </w:r>
           </w:p>
@@ -9015,11 +8336,6 @@
               <w:jc w:val="left"/>
             </w:pPr>
             <w:r>
-              <w:rPr>
-                <w:rFonts w:ascii="Times New Roman" w:hAnsi="Times New Roman" w:eastAsia="宋体"/>
-                <w:b w:val="0"/>
-                <w:sz w:val="18"/>
-              </w:rPr>
               <w:t>标记异常并写入异常记录表</w:t>
             </w:r>
           </w:p>
@@ -9035,12 +8351,7 @@
               <w:jc w:val="left"/>
             </w:pPr>
             <w:r>
-              <w:rPr>
-                <w:rFonts w:ascii="Times New Roman" w:hAnsi="Times New Roman" w:eastAsia="宋体"/>
-                <w:b w:val="0"/>
-                <w:sz w:val="18"/>
-              </w:rPr>
-              <w:t>检测到异常值，请确认数据来源</w:t>
+              <w:t>检测到异常值, 请确认数据来源</w:t>
             </w:r>
           </w:p>
         </w:tc>
@@ -9096,11 +8407,6 @@
               <w:jc w:val="left"/>
             </w:pPr>
             <w:r>
-              <w:rPr>
-                <w:rFonts w:ascii="Times New Roman" w:hAnsi="Times New Roman" w:eastAsia="宋体"/>
-                <w:b w:val="0"/>
-                <w:sz w:val="18"/>
-              </w:rPr>
               <w:t>记录错误日志并允许重新运行</w:t>
             </w:r>
           </w:p>
@@ -9116,12 +8422,7 @@
               <w:jc w:val="left"/>
             </w:pPr>
             <w:r>
-              <w:rPr>
-                <w:rFonts w:ascii="Times New Roman" w:hAnsi="Times New Roman" w:eastAsia="宋体"/>
-                <w:b w:val="0"/>
-                <w:sz w:val="18"/>
-              </w:rPr>
-              <w:t>模型服务暂不可用，请稍后重试</w:t>
+              <w:t>模型服务暂不可用, 请稍后重试或检查产物路径</w:t>
             </w:r>
           </w:p>
         </w:tc>
@@ -9177,31 +8478,21 @@
               <w:jc w:val="left"/>
             </w:pPr>
             <w:r>
-              <w:rPr>
-                <w:rFonts w:ascii="Times New Roman" w:hAnsi="Times New Roman" w:eastAsia="宋体"/>
-                <w:b w:val="0"/>
-                <w:sz w:val="18"/>
-              </w:rPr>
-              <w:t>拒绝访问目标功能</w:t>
-            </w:r>
-          </w:p>
-        </w:tc>
-        <w:tc>
-          <w:tcPr>
-            <w:tcW w:w="3079" w:type="dxa"/>
-            <w:vAlign w:val="center"/>
-          </w:tcPr>
-          <w:p>
-            <w:pPr>
-              <w:spacing w:after="0" w:line="240" w:lineRule="auto"/>
-              <w:jc w:val="left"/>
-            </w:pPr>
-            <w:r>
-              <w:rPr>
-                <w:rFonts w:ascii="Times New Roman" w:hAnsi="Times New Roman" w:eastAsia="宋体"/>
-                <w:b w:val="0"/>
-                <w:sz w:val="18"/>
-              </w:rPr>
+              <w:t>拒绝访问目标功能并返回401/403</w:t>
+            </w:r>
+          </w:p>
+        </w:tc>
+        <w:tc>
+          <w:tcPr>
+            <w:tcW w:w="3079" w:type="dxa"/>
+            <w:vAlign w:val="center"/>
+          </w:tcPr>
+          <w:p>
+            <w:pPr>
+              <w:spacing w:after="0" w:line="240" w:lineRule="auto"/>
+              <w:jc w:val="left"/>
+            </w:pPr>
+            <w:r>
               <w:t>当前账号无权执行该操作</w:t>
             </w:r>
           </w:p>
@@ -9379,11 +8670,6 @@
               <w:jc w:val="left"/>
             </w:pPr>
             <w:r>
-              <w:rPr>
-                <w:rFonts w:ascii="Times New Roman" w:hAnsi="Times New Roman" w:eastAsia="宋体"/>
-                <w:b w:val="0"/>
-                <w:sz w:val="18"/>
-              </w:rPr>
               <w:t>多模态融合</w:t>
             </w:r>
           </w:p>
@@ -9399,31 +8685,21 @@
               <w:jc w:val="left"/>
             </w:pPr>
             <w:r>
-              <w:rPr>
-                <w:rFonts w:ascii="Times New Roman" w:hAnsi="Times New Roman" w:eastAsia="宋体"/>
-                <w:b w:val="0"/>
-                <w:sz w:val="18"/>
-              </w:rPr>
-              <w:t>融合水质、气象、水文、水利和空间站点数据</w:t>
-            </w:r>
-          </w:p>
-        </w:tc>
-        <w:tc>
-          <w:tcPr>
-            <w:tcW w:w="3079" w:type="dxa"/>
-            <w:vAlign w:val="center"/>
-          </w:tcPr>
-          <w:p>
-            <w:pPr>
-              <w:spacing w:after="0" w:line="240" w:lineRule="auto"/>
-              <w:jc w:val="left"/>
-            </w:pPr>
-            <w:r>
-              <w:rPr>
-                <w:rFonts w:ascii="Times New Roman" w:hAnsi="Times New Roman" w:eastAsia="宋体"/>
-                <w:b w:val="0"/>
-                <w:sz w:val="18"/>
-              </w:rPr>
+              <w:t>融合水质、气象、水文和空间站点数据, 构建891天训练ready多模态记录</w:t>
+            </w:r>
+          </w:p>
+        </w:tc>
+        <w:tc>
+          <w:tcPr>
+            <w:tcW w:w="3079" w:type="dxa"/>
+            <w:vAlign w:val="center"/>
+          </w:tcPr>
+          <w:p>
+            <w:pPr>
+              <w:spacing w:after="0" w:line="240" w:lineRule="auto"/>
+              <w:jc w:val="left"/>
+            </w:pPr>
+            <w:r>
               <w:t>提高浊度预测和成因分析的数据基础完整性</w:t>
             </w:r>
           </w:p>
@@ -9460,52 +8736,37 @@
               <w:jc w:val="left"/>
             </w:pPr>
             <w:r>
-              <w:rPr>
-                <w:rFonts w:ascii="Times New Roman" w:hAnsi="Times New Roman" w:eastAsia="宋体"/>
-                <w:b w:val="0"/>
-                <w:sz w:val="18"/>
-              </w:rPr>
-              <w:t>动态预测</w:t>
-            </w:r>
-          </w:p>
-        </w:tc>
-        <w:tc>
-          <w:tcPr>
-            <w:tcW w:w="3079" w:type="dxa"/>
-            <w:vAlign w:val="center"/>
-          </w:tcPr>
-          <w:p>
-            <w:pPr>
-              <w:spacing w:after="0" w:line="240" w:lineRule="auto"/>
-              <w:jc w:val="left"/>
-            </w:pPr>
-            <w:r>
-              <w:rPr>
-                <w:rFonts w:ascii="Times New Roman" w:hAnsi="Times New Roman" w:eastAsia="宋体"/>
-                <w:b w:val="0"/>
-                <w:sz w:val="18"/>
-              </w:rPr>
-              <w:t>利用MSCIM模型输出浊度预测序列</w:t>
-            </w:r>
-          </w:p>
-        </w:tc>
-        <w:tc>
-          <w:tcPr>
-            <w:tcW w:w="3079" w:type="dxa"/>
-            <w:vAlign w:val="center"/>
-          </w:tcPr>
-          <w:p>
-            <w:pPr>
-              <w:spacing w:after="0" w:line="240" w:lineRule="auto"/>
-              <w:jc w:val="left"/>
-            </w:pPr>
-            <w:r>
-              <w:rPr>
-                <w:rFonts w:ascii="Times New Roman" w:hAnsi="Times New Roman" w:eastAsia="宋体"/>
-                <w:b w:val="0"/>
-                <w:sz w:val="18"/>
-              </w:rPr>
-              <w:t>辅助提前判断水体浑浊变化趋势</w:t>
+              <w:t>多模型预测</w:t>
+            </w:r>
+          </w:p>
+        </w:tc>
+        <w:tc>
+          <w:tcPr>
+            <w:tcW w:w="3079" w:type="dxa"/>
+            <w:vAlign w:val="center"/>
+          </w:tcPr>
+          <w:p>
+            <w:pPr>
+              <w:spacing w:after="0" w:line="240" w:lineRule="auto"/>
+              <w:jc w:val="left"/>
+            </w:pPr>
+            <w:r>
+              <w:t>MSCIM(R squared=0.7735)、MSCIM-NoKG(R squared=0.7644)、CMFBE-ST-GCN(R squared=0.7106)</w:t>
+            </w:r>
+          </w:p>
+        </w:tc>
+        <w:tc>
+          <w:tcPr>
+            <w:tcW w:w="3079" w:type="dxa"/>
+            <w:vAlign w:val="center"/>
+          </w:tcPr>
+          <w:p>
+            <w:pPr>
+              <w:spacing w:after="0" w:line="240" w:lineRule="auto"/>
+              <w:jc w:val="left"/>
+            </w:pPr>
+            <w:r>
+              <w:t>多模型对比增强预测可靠性; CMFBE提供机制可解释性</w:t>
             </w:r>
           </w:p>
         </w:tc>
@@ -9541,11 +8802,6 @@
               <w:jc w:val="left"/>
             </w:pPr>
             <w:r>
-              <w:rPr>
-                <w:rFonts w:ascii="Times New Roman" w:hAnsi="Times New Roman" w:eastAsia="宋体"/>
-                <w:b w:val="0"/>
-                <w:sz w:val="18"/>
-              </w:rPr>
               <w:t>交互可视化</w:t>
             </w:r>
           </w:p>
@@ -9561,32 +8817,22 @@
               <w:jc w:val="left"/>
             </w:pPr>
             <w:r>
-              <w:rPr>
-                <w:rFonts w:ascii="Times New Roman" w:hAnsi="Times New Roman" w:eastAsia="宋体"/>
-                <w:b w:val="0"/>
-                <w:sz w:val="18"/>
-              </w:rPr>
-              <w:t>提供看板、曲线、地图和对比图</w:t>
-            </w:r>
-          </w:p>
-        </w:tc>
-        <w:tc>
-          <w:tcPr>
-            <w:tcW w:w="3079" w:type="dxa"/>
-            <w:vAlign w:val="center"/>
-          </w:tcPr>
-          <w:p>
-            <w:pPr>
-              <w:spacing w:after="0" w:line="240" w:lineRule="auto"/>
-              <w:jc w:val="left"/>
-            </w:pPr>
-            <w:r>
-              <w:rPr>
-                <w:rFonts w:ascii="Times New Roman" w:hAnsi="Times New Roman" w:eastAsia="宋体"/>
-                <w:b w:val="0"/>
-                <w:sz w:val="18"/>
-              </w:rPr>
-              <w:t>降低数据分析门槛，提高业务使用效率</w:t>
+              <w:t>提供SVG时序图、预测对比图、场景分诊面板和诊断看板</w:t>
+            </w:r>
+          </w:p>
+        </w:tc>
+        <w:tc>
+          <w:tcPr>
+            <w:tcW w:w="3079" w:type="dxa"/>
+            <w:vAlign w:val="center"/>
+          </w:tcPr>
+          <w:p>
+            <w:pPr>
+              <w:spacing w:after="0" w:line="240" w:lineRule="auto"/>
+              <w:jc w:val="left"/>
+            </w:pPr>
+            <w:r>
+              <w:t>降低数据分析门槛, 提高业务使用效率</w:t>
             </w:r>
           </w:p>
         </w:tc>
@@ -9622,11 +8868,6 @@
               <w:jc w:val="left"/>
             </w:pPr>
             <w:r>
-              <w:rPr>
-                <w:rFonts w:ascii="Times New Roman" w:hAnsi="Times New Roman" w:eastAsia="宋体"/>
-                <w:b w:val="0"/>
-                <w:sz w:val="18"/>
-              </w:rPr>
               <w:t>因果归因</w:t>
             </w:r>
           </w:p>
@@ -9642,32 +8883,22 @@
               <w:jc w:val="left"/>
             </w:pPr>
             <w:r>
-              <w:rPr>
-                <w:rFonts w:ascii="Times New Roman" w:hAnsi="Times New Roman" w:eastAsia="宋体"/>
-                <w:b w:val="0"/>
-                <w:sz w:val="18"/>
-              </w:rPr>
-              <w:t>结合因果推断和知识图谱识别主导致浊因子</w:t>
-            </w:r>
-          </w:p>
-        </w:tc>
-        <w:tc>
-          <w:tcPr>
-            <w:tcW w:w="3079" w:type="dxa"/>
-            <w:vAlign w:val="center"/>
-          </w:tcPr>
-          <w:p>
-            <w:pPr>
-              <w:spacing w:after="0" w:line="240" w:lineRule="auto"/>
-              <w:jc w:val="left"/>
-            </w:pPr>
-            <w:r>
-              <w:rPr>
-                <w:rFonts w:ascii="Times New Roman" w:hAnsi="Times New Roman" w:eastAsia="宋体"/>
-                <w:b w:val="0"/>
-                <w:sz w:val="18"/>
-              </w:rPr>
-              <w:t>帮助解释浑浊机制，为管理决策提供依据</w:t>
+              <w:t>结合Sobol敏感性分析、场景分诊和知识图谱识别主导致浊因子</w:t>
+            </w:r>
+          </w:p>
+        </w:tc>
+        <w:tc>
+          <w:tcPr>
+            <w:tcW w:w="3079" w:type="dxa"/>
+            <w:vAlign w:val="center"/>
+          </w:tcPr>
+          <w:p>
+            <w:pPr>
+              <w:spacing w:after="0" w:line="240" w:lineRule="auto"/>
+              <w:jc w:val="left"/>
+            </w:pPr>
+            <w:r>
+              <w:t>帮助解释浑浊机制, 为管理决策提供依据</w:t>
             </w:r>
           </w:p>
         </w:tc>
@@ -9703,11 +8934,6 @@
               <w:jc w:val="left"/>
             </w:pPr>
             <w:r>
-              <w:rPr>
-                <w:rFonts w:ascii="Times New Roman" w:hAnsi="Times New Roman" w:eastAsia="宋体"/>
-                <w:b w:val="0"/>
-                <w:sz w:val="18"/>
-              </w:rPr>
               <w:t>报告输出</w:t>
             </w:r>
           </w:p>
@@ -9723,31 +8949,21 @@
               <w:jc w:val="left"/>
             </w:pPr>
             <w:r>
-              <w:rPr>
-                <w:rFonts w:ascii="Times New Roman" w:hAnsi="Times New Roman" w:eastAsia="宋体"/>
-                <w:b w:val="0"/>
-                <w:sz w:val="18"/>
-              </w:rPr>
-              <w:t>自动生成预测对比和诊断分析报告</w:t>
-            </w:r>
-          </w:p>
-        </w:tc>
-        <w:tc>
-          <w:tcPr>
-            <w:tcW w:w="3079" w:type="dxa"/>
-            <w:vAlign w:val="center"/>
-          </w:tcPr>
-          <w:p>
-            <w:pPr>
-              <w:spacing w:after="0" w:line="240" w:lineRule="auto"/>
-              <w:jc w:val="left"/>
-            </w:pPr>
-            <w:r>
-              <w:rPr>
-                <w:rFonts w:ascii="Times New Roman" w:hAnsi="Times New Roman" w:eastAsia="宋体"/>
-                <w:b w:val="0"/>
-                <w:sz w:val="18"/>
-              </w:rPr>
+              <w:t>支持HTML/Markdown/JSON/PDF多格式综合报告自动生成</w:t>
+            </w:r>
+          </w:p>
+        </w:tc>
+        <w:tc>
+          <w:tcPr>
+            <w:tcW w:w="3079" w:type="dxa"/>
+            <w:vAlign w:val="center"/>
+          </w:tcPr>
+          <w:p>
+            <w:pPr>
+              <w:spacing w:after="0" w:line="240" w:lineRule="auto"/>
+              <w:jc w:val="left"/>
+            </w:pPr>
+            <w:r>
               <w:t>便于科研记录、业务汇报和成果归档</w:t>
             </w:r>
           </w:p>
@@ -9828,11 +9044,6 @@
               <w:jc w:val="center"/>
             </w:pPr>
             <w:r>
-              <w:rPr>
-                <w:rFonts w:ascii="Times New Roman" w:hAnsi="Times New Roman" w:eastAsia="宋体"/>
-                <w:b/>
-                <w:sz w:val="20"/>
-              </w:rPr>
               <w:t>软件全称</w:t>
             </w:r>
           </w:p>
@@ -9848,12 +9059,7 @@
               <w:jc w:val="left"/>
             </w:pPr>
             <w:r>
-              <w:rPr>
-                <w:rFonts w:ascii="Times New Roman" w:hAnsi="Times New Roman" w:eastAsia="宋体"/>
-                <w:b w:val="0"/>
-                <w:sz w:val="20"/>
-              </w:rPr>
-              <w:t>基于多模态数据融合的水体浊度预测系统</w:t>
+              <w:t>基于多源水质数据融合的水体透明度预测系统</w:t>
             </w:r>
           </w:p>
         </w:tc>
@@ -9890,11 +9096,6 @@
               <w:jc w:val="center"/>
             </w:pPr>
             <w:r>
-              <w:rPr>
-                <w:rFonts w:ascii="Times New Roman" w:hAnsi="Times New Roman" w:eastAsia="宋体"/>
-                <w:b/>
-                <w:sz w:val="20"/>
-              </w:rPr>
               <w:t>软件简称</w:t>
             </w:r>
           </w:p>
@@ -9910,12 +9111,7 @@
               <w:jc w:val="left"/>
             </w:pPr>
             <w:r>
-              <w:rPr>
-                <w:rFonts w:ascii="Times New Roman" w:hAnsi="Times New Roman" w:eastAsia="宋体"/>
-                <w:b w:val="0"/>
-                <w:sz w:val="20"/>
-              </w:rPr>
-              <w:t>水体浊度预测系统</w:t>
+              <w:t>水体透明度预测系统</w:t>
             </w:r>
           </w:p>
         </w:tc>
@@ -10138,11 +9334,6 @@
               <w:jc w:val="center"/>
             </w:pPr>
             <w:r>
-              <w:rPr>
-                <w:rFonts w:ascii="Times New Roman" w:hAnsi="Times New Roman" w:eastAsia="宋体"/>
-                <w:b/>
-                <w:sz w:val="20"/>
-              </w:rPr>
               <w:t>主要功能</w:t>
             </w:r>
           </w:p>
@@ -10158,12 +9349,7 @@
               <w:jc w:val="left"/>
             </w:pPr>
             <w:r>
-              <w:rPr>
-                <w:rFonts w:ascii="Times New Roman" w:hAnsi="Times New Roman" w:eastAsia="宋体"/>
-                <w:b w:val="0"/>
-                <w:sz w:val="20"/>
-              </w:rPr>
-              <w:t>多源水环境数据融合管理、水质可视化交互、浊度动态预测模拟、致浊因子因果诊断与归因分析</w:t>
+              <w:t>多源水环境数据融合管理、水质可视化交互、浊度/透明度动态预测模拟、致浊因子因果诊断与归因分析、场景分诊与响应建议</w:t>
             </w:r>
           </w:p>
         </w:tc>
@@ -10200,11 +9386,6 @@
               <w:jc w:val="center"/>
             </w:pPr>
             <w:r>
-              <w:rPr>
-                <w:rFonts w:ascii="Times New Roman" w:hAnsi="Times New Roman" w:eastAsia="宋体"/>
-                <w:b/>
-                <w:sz w:val="20"/>
-              </w:rPr>
               <w:t>技术特点</w:t>
             </w:r>
           </w:p>
@@ -10220,12 +9401,7 @@
               <w:jc w:val="left"/>
             </w:pPr>
             <w:r>
-              <w:rPr>
-                <w:rFonts w:ascii="Times New Roman" w:hAnsi="Times New Roman" w:eastAsia="宋体"/>
-                <w:b w:val="0"/>
-                <w:sz w:val="20"/>
-              </w:rPr>
-              <w:t>多模态数据融合、MSCIM模型预测、时序与空间联合分析、知识图谱辅助归因、预测结果可视化对比</w:t>
+              <w:t>多模态数据融合、MSCIM+CMFBE-ST-GCN双模型预测、知识图谱辅助归因、Sobol灵敏度分析、场景分诊分类、多格式报告输出</w:t>
             </w:r>
           </w:p>
         </w:tc>
@@ -10262,11 +9438,6 @@
               <w:jc w:val="center"/>
             </w:pPr>
             <w:r>
-              <w:rPr>
-                <w:rFonts w:ascii="Times New Roman" w:hAnsi="Times New Roman" w:eastAsia="宋体"/>
-                <w:b/>
-                <w:sz w:val="20"/>
-              </w:rPr>
               <w:t>运行环境</w:t>
             </w:r>
           </w:p>
@@ -10282,12 +9453,7 @@
               <w:jc w:val="left"/>
             </w:pPr>
             <w:r>
-              <w:rPr>
-                <w:rFonts w:ascii="Times New Roman" w:hAnsi="Times New Roman" w:eastAsia="宋体"/>
-                <w:b w:val="0"/>
-                <w:sz w:val="20"/>
-              </w:rPr>
-              <w:t>Windows/Linux服务器，浏览器客户端，关系数据库、时序数据库和图数据库环境</w:t>
+              <w:t>Windows/Linux服务器, Python 3.12+, Chrome/Edge浏览器, SQLite数据管理</w:t>
             </w:r>
           </w:p>
         </w:tc>
@@ -10457,11 +9623,6 @@
               <w:jc w:val="left"/>
             </w:pPr>
             <w:r>
-              <w:rPr>
-                <w:rFonts w:ascii="Times New Roman" w:hAnsi="Times New Roman" w:eastAsia="宋体"/>
-                <w:b w:val="0"/>
-                <w:sz w:val="18"/>
-              </w:rPr>
               <w:t>登录界面</w:t>
             </w:r>
           </w:p>
@@ -10477,31 +9638,21 @@
               <w:jc w:val="left"/>
             </w:pPr>
             <w:r>
-              <w:rPr>
-                <w:rFonts w:ascii="Times New Roman" w:hAnsi="Times New Roman" w:eastAsia="宋体"/>
-                <w:b w:val="0"/>
-                <w:sz w:val="18"/>
-              </w:rPr>
-              <w:t>账号输入框、密码输入框、登录按钮</w:t>
-            </w:r>
-          </w:p>
-        </w:tc>
-        <w:tc>
-          <w:tcPr>
-            <w:tcW w:w="3079" w:type="dxa"/>
-            <w:vAlign w:val="center"/>
-          </w:tcPr>
-          <w:p>
-            <w:pPr>
-              <w:spacing w:after="0" w:line="240" w:lineRule="auto"/>
-              <w:jc w:val="left"/>
-            </w:pPr>
-            <w:r>
-              <w:rPr>
-                <w:rFonts w:ascii="Times New Roman" w:hAnsi="Times New Roman" w:eastAsia="宋体"/>
-                <w:b w:val="0"/>
-                <w:sz w:val="18"/>
-              </w:rPr>
+              <w:t>系统标题、账号密码输入、一键填入演示账号、主题切换</w:t>
+            </w:r>
+          </w:p>
+        </w:tc>
+        <w:tc>
+          <w:tcPr>
+            <w:tcW w:w="3079" w:type="dxa"/>
+            <w:vAlign w:val="center"/>
+          </w:tcPr>
+          <w:p>
+            <w:pPr>
+              <w:spacing w:after="0" w:line="240" w:lineRule="auto"/>
+              <w:jc w:val="left"/>
+            </w:pPr>
+            <w:r>
               <w:t>完成用户身份验证并进入系统</w:t>
             </w:r>
           </w:p>
@@ -10538,51 +9689,36 @@
               <w:jc w:val="left"/>
             </w:pPr>
             <w:r>
-              <w:rPr>
-                <w:rFonts w:ascii="Times New Roman" w:hAnsi="Times New Roman" w:eastAsia="宋体"/>
-                <w:b w:val="0"/>
-                <w:sz w:val="18"/>
-              </w:rPr>
-              <w:t>首页看板</w:t>
-            </w:r>
-          </w:p>
-        </w:tc>
-        <w:tc>
-          <w:tcPr>
-            <w:tcW w:w="3079" w:type="dxa"/>
-            <w:vAlign w:val="center"/>
-          </w:tcPr>
-          <w:p>
-            <w:pPr>
-              <w:spacing w:after="0" w:line="240" w:lineRule="auto"/>
-              <w:jc w:val="left"/>
-            </w:pPr>
-            <w:r>
-              <w:rPr>
-                <w:rFonts w:ascii="Times New Roman" w:hAnsi="Times New Roman" w:eastAsia="宋体"/>
-                <w:b w:val="0"/>
-                <w:sz w:val="18"/>
-              </w:rPr>
-              <w:t>站点数量、最新浊度、异常指标、预测任务、趋势图</w:t>
-            </w:r>
-          </w:p>
-        </w:tc>
-        <w:tc>
-          <w:tcPr>
-            <w:tcW w:w="3079" w:type="dxa"/>
-            <w:vAlign w:val="center"/>
-          </w:tcPr>
-          <w:p>
-            <w:pPr>
-              <w:spacing w:after="0" w:line="240" w:lineRule="auto"/>
-              <w:jc w:val="left"/>
-            </w:pPr>
-            <w:r>
-              <w:rPr>
-                <w:rFonts w:ascii="Times New Roman" w:hAnsi="Times New Roman" w:eastAsia="宋体"/>
-                <w:b w:val="0"/>
-                <w:sz w:val="18"/>
-              </w:rPr>
+              <w:t>系统总览(首页)</w:t>
+            </w:r>
+          </w:p>
+        </w:tc>
+        <w:tc>
+          <w:tcPr>
+            <w:tcW w:w="3079" w:type="dxa"/>
+            <w:vAlign w:val="center"/>
+          </w:tcPr>
+          <w:p>
+            <w:pPr>
+              <w:spacing w:after="0" w:line="240" w:lineRule="auto"/>
+              <w:jc w:val="left"/>
+            </w:pPr>
+            <w:r>
+              <w:t>站点统计、模型性能卡片(R squared)、模型对比表、高优先级事件列表、侧栏导航</w:t>
+            </w:r>
+          </w:p>
+        </w:tc>
+        <w:tc>
+          <w:tcPr>
+            <w:tcW w:w="3079" w:type="dxa"/>
+            <w:vAlign w:val="center"/>
+          </w:tcPr>
+          <w:p>
+            <w:pPr>
+              <w:spacing w:after="0" w:line="240" w:lineRule="auto"/>
+              <w:jc w:val="left"/>
+            </w:pPr>
+            <w:r>
               <w:t>展示系统总体运行状态和水质概况</w:t>
             </w:r>
           </w:p>
@@ -10619,52 +9755,37 @@
               <w:jc w:val="left"/>
             </w:pPr>
             <w:r>
-              <w:rPr>
-                <w:rFonts w:ascii="Times New Roman" w:hAnsi="Times New Roman" w:eastAsia="宋体"/>
-                <w:b w:val="0"/>
-                <w:sz w:val="18"/>
-              </w:rPr>
-              <w:t>数据管理界面</w:t>
-            </w:r>
-          </w:p>
-        </w:tc>
-        <w:tc>
-          <w:tcPr>
-            <w:tcW w:w="3079" w:type="dxa"/>
-            <w:vAlign w:val="center"/>
-          </w:tcPr>
-          <w:p>
-            <w:pPr>
-              <w:spacing w:after="0" w:line="240" w:lineRule="auto"/>
-              <w:jc w:val="left"/>
-            </w:pPr>
-            <w:r>
-              <w:rPr>
-                <w:rFonts w:ascii="Times New Roman" w:hAnsi="Times New Roman" w:eastAsia="宋体"/>
-                <w:b w:val="0"/>
-                <w:sz w:val="18"/>
-              </w:rPr>
-              <w:t>数据类别选择、文件上传、字段映射、导入记录表</w:t>
-            </w:r>
-          </w:p>
-        </w:tc>
-        <w:tc>
-          <w:tcPr>
-            <w:tcW w:w="3079" w:type="dxa"/>
-            <w:vAlign w:val="center"/>
-          </w:tcPr>
-          <w:p>
-            <w:pPr>
-              <w:spacing w:after="0" w:line="240" w:lineRule="auto"/>
-              <w:jc w:val="left"/>
-            </w:pPr>
-            <w:r>
-              <w:rPr>
-                <w:rFonts w:ascii="Times New Roman" w:hAnsi="Times New Roman" w:eastAsia="宋体"/>
-                <w:b w:val="0"/>
-                <w:sz w:val="18"/>
-              </w:rPr>
-              <w:t>完成多源数据导入、清洗和入库</w:t>
+              <w:t>水质综合数据库</w:t>
+            </w:r>
+          </w:p>
+        </w:tc>
+        <w:tc>
+          <w:tcPr>
+            <w:tcW w:w="3079" w:type="dxa"/>
+            <w:vAlign w:val="center"/>
+          </w:tcPr>
+          <w:p>
+            <w:pPr>
+              <w:spacing w:after="0" w:line="240" w:lineRule="auto"/>
+              <w:jc w:val="left"/>
+            </w:pPr>
+            <w:r>
+              <w:t>站点选择、关键词搜索、日期范围筛选、数据分页表格、数据库统计摘要</w:t>
+            </w:r>
+          </w:p>
+        </w:tc>
+        <w:tc>
+          <w:tcPr>
+            <w:tcW w:w="3079" w:type="dxa"/>
+            <w:vAlign w:val="center"/>
+          </w:tcPr>
+          <w:p>
+            <w:pPr>
+              <w:spacing w:after="0" w:line="240" w:lineRule="auto"/>
+              <w:jc w:val="left"/>
+            </w:pPr>
+            <w:r>
+              <w:t>完成多站点水质数据的交互查询与浏览</w:t>
             </w:r>
           </w:p>
         </w:tc>
@@ -10700,52 +9821,37 @@
               <w:jc w:val="left"/>
             </w:pPr>
             <w:r>
-              <w:rPr>
-                <w:rFonts w:ascii="Times New Roman" w:hAnsi="Times New Roman" w:eastAsia="宋体"/>
-                <w:b w:val="0"/>
-                <w:sz w:val="18"/>
-              </w:rPr>
-              <w:t>水质可视化界面</w:t>
-            </w:r>
-          </w:p>
-        </w:tc>
-        <w:tc>
-          <w:tcPr>
-            <w:tcW w:w="3079" w:type="dxa"/>
-            <w:vAlign w:val="center"/>
-          </w:tcPr>
-          <w:p>
-            <w:pPr>
-              <w:spacing w:after="0" w:line="240" w:lineRule="auto"/>
-              <w:jc w:val="left"/>
-            </w:pPr>
-            <w:r>
-              <w:rPr>
-                <w:rFonts w:ascii="Times New Roman" w:hAnsi="Times New Roman" w:eastAsia="宋体"/>
-                <w:b w:val="0"/>
-                <w:sz w:val="18"/>
-              </w:rPr>
-              <w:t>筛选区、时序曲线、空间地图、指标卡片</w:t>
-            </w:r>
-          </w:p>
-        </w:tc>
-        <w:tc>
-          <w:tcPr>
-            <w:tcW w:w="3079" w:type="dxa"/>
-            <w:vAlign w:val="center"/>
-          </w:tcPr>
-          <w:p>
-            <w:pPr>
-              <w:spacing w:after="0" w:line="240" w:lineRule="auto"/>
-              <w:jc w:val="left"/>
-            </w:pPr>
-            <w:r>
-              <w:rPr>
-                <w:rFonts w:ascii="Times New Roman" w:hAnsi="Times New Roman" w:eastAsia="宋体"/>
-                <w:b w:val="0"/>
-                <w:sz w:val="18"/>
-              </w:rPr>
-              <w:t>展示水质指标变化趋势和空间分布</w:t>
+              <w:t>数据上传界面</w:t>
+            </w:r>
+          </w:p>
+        </w:tc>
+        <w:tc>
+          <w:tcPr>
+            <w:tcW w:w="3079" w:type="dxa"/>
+            <w:vAlign w:val="center"/>
+          </w:tcPr>
+          <w:p>
+            <w:pPr>
+              <w:spacing w:after="0" w:line="240" w:lineRule="auto"/>
+              <w:jc w:val="left"/>
+            </w:pPr>
+            <w:r>
+              <w:t>数据类型选择、站点选择、多文件上传、上传进度条、已导入记录表</w:t>
+            </w:r>
+          </w:p>
+        </w:tc>
+        <w:tc>
+          <w:tcPr>
+            <w:tcW w:w="3079" w:type="dxa"/>
+            <w:vAlign w:val="center"/>
+          </w:tcPr>
+          <w:p>
+            <w:pPr>
+              <w:spacing w:after="0" w:line="240" w:lineRule="auto"/>
+              <w:jc w:val="left"/>
+            </w:pPr>
+            <w:r>
+              <w:t>完成多源数据文件上传和导入管理</w:t>
             </w:r>
           </w:p>
         </w:tc>
@@ -10781,52 +9887,37 @@
               <w:jc w:val="left"/>
             </w:pPr>
             <w:r>
-              <w:rPr>
-                <w:rFonts w:ascii="Times New Roman" w:hAnsi="Times New Roman" w:eastAsia="宋体"/>
-                <w:b w:val="0"/>
-                <w:sz w:val="18"/>
-              </w:rPr>
-              <w:t>浊度预测界面</w:t>
-            </w:r>
-          </w:p>
-        </w:tc>
-        <w:tc>
-          <w:tcPr>
-            <w:tcW w:w="3079" w:type="dxa"/>
-            <w:vAlign w:val="center"/>
-          </w:tcPr>
-          <w:p>
-            <w:pPr>
-              <w:spacing w:after="0" w:line="240" w:lineRule="auto"/>
-              <w:jc w:val="left"/>
-            </w:pPr>
-            <w:r>
-              <w:rPr>
-                <w:rFonts w:ascii="Times New Roman" w:hAnsi="Times New Roman" w:eastAsia="宋体"/>
-                <w:b w:val="0"/>
-                <w:sz w:val="18"/>
-              </w:rPr>
-              <w:t>区域选择、时间范围、模型版本、预测按钮、结果图表</w:t>
-            </w:r>
-          </w:p>
-        </w:tc>
-        <w:tc>
-          <w:tcPr>
-            <w:tcW w:w="3079" w:type="dxa"/>
-            <w:vAlign w:val="center"/>
-          </w:tcPr>
-          <w:p>
-            <w:pPr>
-              <w:spacing w:after="0" w:line="240" w:lineRule="auto"/>
-              <w:jc w:val="left"/>
-            </w:pPr>
-            <w:r>
-              <w:rPr>
-                <w:rFonts w:ascii="Times New Roman" w:hAnsi="Times New Roman" w:eastAsia="宋体"/>
-                <w:b w:val="0"/>
-                <w:sz w:val="18"/>
-              </w:rPr>
-              <w:t>配置预测任务并查看预测结果</w:t>
+              <w:t>数据预处理界面</w:t>
+            </w:r>
+          </w:p>
+        </w:tc>
+        <w:tc>
+          <w:tcPr>
+            <w:tcW w:w="3079" w:type="dxa"/>
+            <w:vAlign w:val="center"/>
+          </w:tcPr>
+          <w:p>
+            <w:pPr>
+              <w:spacing w:after="0" w:line="240" w:lineRule="auto"/>
+              <w:jc w:val="left"/>
+            </w:pPr>
+            <w:r>
+              <w:t>站点选择、预处理状态摘要、数据可用性统计、预处理日志</w:t>
+            </w:r>
+          </w:p>
+        </w:tc>
+        <w:tc>
+          <w:tcPr>
+            <w:tcW w:w="3079" w:type="dxa"/>
+            <w:vAlign w:val="center"/>
+          </w:tcPr>
+          <w:p>
+            <w:pPr>
+              <w:spacing w:after="0" w:line="240" w:lineRule="auto"/>
+              <w:jc w:val="left"/>
+            </w:pPr>
+            <w:r>
+              <w:t>查看数据预处理结果和数据质量概况</w:t>
             </w:r>
           </w:p>
         </w:tc>
@@ -10862,52 +9953,37 @@
               <w:jc w:val="left"/>
             </w:pPr>
             <w:r>
-              <w:rPr>
-                <w:rFonts w:ascii="Times New Roman" w:hAnsi="Times New Roman" w:eastAsia="宋体"/>
-                <w:b w:val="0"/>
-                <w:sz w:val="18"/>
-              </w:rPr>
-              <w:t>因果诊断界面</w:t>
-            </w:r>
-          </w:p>
-        </w:tc>
-        <w:tc>
-          <w:tcPr>
-            <w:tcW w:w="3079" w:type="dxa"/>
-            <w:vAlign w:val="center"/>
-          </w:tcPr>
-          <w:p>
-            <w:pPr>
-              <w:spacing w:after="0" w:line="240" w:lineRule="auto"/>
-              <w:jc w:val="left"/>
-            </w:pPr>
-            <w:r>
-              <w:rPr>
-                <w:rFonts w:ascii="Times New Roman" w:hAnsi="Times New Roman" w:eastAsia="宋体"/>
-                <w:b w:val="0"/>
-                <w:sz w:val="18"/>
-              </w:rPr>
-              <w:t>因子排序、贡献度图、知识图谱、报告生成按钮</w:t>
-            </w:r>
-          </w:p>
-        </w:tc>
-        <w:tc>
-          <w:tcPr>
-            <w:tcW w:w="3079" w:type="dxa"/>
-            <w:vAlign w:val="center"/>
-          </w:tcPr>
-          <w:p>
-            <w:pPr>
-              <w:spacing w:after="0" w:line="240" w:lineRule="auto"/>
-              <w:jc w:val="left"/>
-            </w:pPr>
-            <w:r>
-              <w:rPr>
-                <w:rFonts w:ascii="Times New Roman" w:hAnsi="Times New Roman" w:eastAsia="宋体"/>
-                <w:b w:val="0"/>
-                <w:sz w:val="18"/>
-              </w:rPr>
-              <w:t>查看主导致浊因子并生成归因报告</w:t>
+              <w:t>数据可视化界面</w:t>
+            </w:r>
+          </w:p>
+        </w:tc>
+        <w:tc>
+          <w:tcPr>
+            <w:tcW w:w="3079" w:type="dxa"/>
+            <w:vAlign w:val="center"/>
+          </w:tcPr>
+          <w:p>
+            <w:pPr>
+              <w:spacing w:after="0" w:line="240" w:lineRule="auto"/>
+              <w:jc w:val="left"/>
+            </w:pPr>
+            <w:r>
+              <w:t>站点选择、指标选择(浊度/透明度)、数据量滑块、SVG时序曲线图</w:t>
+            </w:r>
+          </w:p>
+        </w:tc>
+        <w:tc>
+          <w:tcPr>
+            <w:tcW w:w="3079" w:type="dxa"/>
+            <w:vAlign w:val="center"/>
+          </w:tcPr>
+          <w:p>
+            <w:pPr>
+              <w:spacing w:after="0" w:line="240" w:lineRule="auto"/>
+              <w:jc w:val="left"/>
+            </w:pPr>
+            <w:r>
+              <w:t>展示浊度/透明度指标的时间序列变化趋势</w:t>
             </w:r>
           </w:p>
         </w:tc>
@@ -10943,52 +10019,37 @@
               <w:jc w:val="left"/>
             </w:pPr>
             <w:r>
-              <w:rPr>
-                <w:rFonts w:ascii="Times New Roman" w:hAnsi="Times New Roman" w:eastAsia="宋体"/>
-                <w:b w:val="0"/>
-                <w:sz w:val="18"/>
-              </w:rPr>
-              <w:t>系统管理界面</w:t>
-            </w:r>
-          </w:p>
-        </w:tc>
-        <w:tc>
-          <w:tcPr>
-            <w:tcW w:w="3079" w:type="dxa"/>
-            <w:vAlign w:val="center"/>
-          </w:tcPr>
-          <w:p>
-            <w:pPr>
-              <w:spacing w:after="0" w:line="240" w:lineRule="auto"/>
-              <w:jc w:val="left"/>
-            </w:pPr>
-            <w:r>
-              <w:rPr>
-                <w:rFonts w:ascii="Times New Roman" w:hAnsi="Times New Roman" w:eastAsia="宋体"/>
-                <w:b w:val="0"/>
-                <w:sz w:val="18"/>
-              </w:rPr>
-              <w:t>用户管理、角色权限、模型版本、日志管理</w:t>
-            </w:r>
-          </w:p>
-        </w:tc>
-        <w:tc>
-          <w:tcPr>
-            <w:tcW w:w="3079" w:type="dxa"/>
-            <w:vAlign w:val="center"/>
-          </w:tcPr>
-          <w:p>
-            <w:pPr>
-              <w:spacing w:after="0" w:line="240" w:lineRule="auto"/>
-              <w:jc w:val="left"/>
-            </w:pPr>
-            <w:r>
-              <w:rPr>
-                <w:rFonts w:ascii="Times New Roman" w:hAnsi="Times New Roman" w:eastAsia="宋体"/>
-                <w:b w:val="0"/>
-                <w:sz w:val="18"/>
-              </w:rPr>
-              <w:t>完成系统运维与权限配置</w:t>
+              <w:t>预测与诊断界面</w:t>
+            </w:r>
+          </w:p>
+        </w:tc>
+        <w:tc>
+          <w:tcPr>
+            <w:tcW w:w="3079" w:type="dxa"/>
+            <w:vAlign w:val="center"/>
+          </w:tcPr>
+          <w:p>
+            <w:pPr>
+              <w:spacing w:after="0" w:line="240" w:lineRule="auto"/>
+              <w:jc w:val="left"/>
+            </w:pPr>
+            <w:r>
+              <w:t>预测曲线图(含风险色带)、创建任务表单、任务列表、模型选择、诊断Tab(诊断结论/阈值与边界/分诊与行动)、主导因子图、场景分诊面板、敏感性概览</w:t>
+            </w:r>
+          </w:p>
+        </w:tc>
+        <w:tc>
+          <w:tcPr>
+            <w:tcW w:w="3079" w:type="dxa"/>
+            <w:vAlign w:val="center"/>
+          </w:tcPr>
+          <w:p>
+            <w:pPr>
+              <w:spacing w:after="0" w:line="240" w:lineRule="auto"/>
+              <w:jc w:val="left"/>
+            </w:pPr>
+            <w:r>
+              <w:t>配置预测任务、查看预测-实测对比、浏览致浊因子诊断和场景分诊结果</w:t>
             </w:r>
           </w:p>
         </w:tc>
@@ -11592,11 +10653,6 @@
               <w:jc w:val="left"/>
             </w:pPr>
             <w:r>
-              <w:rPr>
-                <w:rFonts w:ascii="Times New Roman" w:hAnsi="Times New Roman" w:eastAsia="宋体"/>
-                <w:b w:val="0"/>
-                <w:sz w:val="18"/>
-              </w:rPr>
               <w:t>V1.0</w:t>
             </w:r>
           </w:p>
@@ -11612,32 +10668,22 @@
               <w:jc w:val="left"/>
             </w:pPr>
             <w:r>
-              <w:rPr>
-                <w:rFonts w:ascii="Times New Roman" w:hAnsi="Times New Roman" w:eastAsia="宋体"/>
-                <w:b w:val="0"/>
-                <w:sz w:val="18"/>
-              </w:rPr>
-              <w:t>2026年5月</w:t>
-            </w:r>
-          </w:p>
-        </w:tc>
-        <w:tc>
-          <w:tcPr>
-            <w:tcW w:w="3079" w:type="dxa"/>
-            <w:vAlign w:val="center"/>
-          </w:tcPr>
-          <w:p>
-            <w:pPr>
-              <w:spacing w:after="0" w:line="240" w:lineRule="auto"/>
-              <w:jc w:val="left"/>
-            </w:pPr>
-            <w:r>
-              <w:rPr>
-                <w:rFonts w:ascii="Times New Roman" w:hAnsi="Times New Roman" w:eastAsia="宋体"/>
-                <w:b w:val="0"/>
-                <w:sz w:val="18"/>
-              </w:rPr>
-              <w:t>完成多源数据融合管理、水质可视化、MSCIM浊度预测、预测对比、致浊因子归因诊断和报告导出等基础功能设计。</w:t>
+              <w:t>2026年7月</w:t>
+            </w:r>
+          </w:p>
+        </w:tc>
+        <w:tc>
+          <w:tcPr>
+            <w:tcW w:w="3079" w:type="dxa"/>
+            <w:vAlign w:val="center"/>
+          </w:tcPr>
+          <w:p>
+            <w:pPr>
+              <w:spacing w:after="0" w:line="240" w:lineRule="auto"/>
+              <w:jc w:val="left"/>
+            </w:pPr>
+            <w:r>
+              <w:t>完成多源数据融合管理、水质可视化交互、MSCIM+CMFBE-ST-GCN浊度与透明度预测、预测-实测对比、致浊因子归因诊断、场景分诊分类、响应建议生成、知识图谱辅助推理、Sobol灵敏度分析和多格式报告导出等完整功能。默认站点为吴淞口2586, 匹配宝山气象站、松浦大桥和黄渡水文参考站。</w:t>
             </w:r>
           </w:p>
         </w:tc>

</xml_diff>